<commit_message>
Update document for 2026 project with revised content
</commit_message>
<xml_diff>
--- a/2026_Б_ПІ_ПЗПІ-22-2_Захаров_А_В.docx
+++ b/2026_Б_ПІ_ПЗПІ-22-2_Захаров_А_В.docx
@@ -10,42 +10,12 @@
           <w:lang w:val="ru-RU"/>
         </w:rPr>
       </w:pPr>
-      <w:proofErr w:type="spellStart"/>
       <w:r>
         <w:rPr>
           <w:lang w:val="ru-RU"/>
         </w:rPr>
-        <w:t>Специфікація</w:t>
-      </w:r>
-      <w:proofErr w:type="spellEnd"/>
-      <w:r>
-        <w:rPr>
-          <w:lang w:val="ru-RU"/>
-        </w:rPr>
-        <w:t xml:space="preserve"> </w:t>
-      </w:r>
-      <w:proofErr w:type="spellStart"/>
-      <w:r>
-        <w:rPr>
-          <w:lang w:val="ru-RU"/>
-        </w:rPr>
-        <w:t>програмного</w:t>
-      </w:r>
-      <w:proofErr w:type="spellEnd"/>
-      <w:r>
-        <w:rPr>
-          <w:lang w:val="ru-RU"/>
-        </w:rPr>
-        <w:t xml:space="preserve"> </w:t>
-      </w:r>
-      <w:proofErr w:type="spellStart"/>
-      <w:r>
-        <w:rPr>
-          <w:lang w:val="ru-RU"/>
-        </w:rPr>
-        <w:t>забезпечення</w:t>
-      </w:r>
-      <w:proofErr w:type="spellEnd"/>
+        <w:t>Специфікація програмного забезпечення</w:t>
+      </w:r>
     </w:p>
     <w:p>
       <w:pPr>
@@ -106,44 +76,36 @@
           <w:lang w:val="en-US"/>
         </w:rPr>
       </w:pPr>
-      <w:proofErr w:type="spellStart"/>
       <w:r>
         <w:t>Software</w:t>
       </w:r>
-      <w:proofErr w:type="spellEnd"/>
       <w:r>
         <w:rPr>
           <w:lang w:val="en-US"/>
         </w:rPr>
         <w:t xml:space="preserve"> </w:t>
       </w:r>
-      <w:proofErr w:type="spellStart"/>
       <w:r>
         <w:t>system</w:t>
       </w:r>
-      <w:proofErr w:type="spellEnd"/>
       <w:r>
         <w:rPr>
           <w:lang w:val="en-US"/>
         </w:rPr>
         <w:t xml:space="preserve"> </w:t>
       </w:r>
-      <w:proofErr w:type="spellStart"/>
       <w:r>
         <w:t>requirement</w:t>
       </w:r>
-      <w:proofErr w:type="spellEnd"/>
       <w:r>
         <w:rPr>
           <w:lang w:val="en-US"/>
         </w:rPr>
         <w:t xml:space="preserve"> </w:t>
       </w:r>
-      <w:proofErr w:type="spellStart"/>
       <w:r>
         <w:t>specification</w:t>
       </w:r>
-      <w:proofErr w:type="spellEnd"/>
     </w:p>
     <w:p>
       <w:pPr>
@@ -329,14 +291,12 @@
         </w:rPr>
         <w:t xml:space="preserve"> </w:t>
       </w:r>
-      <w:proofErr w:type="spellStart"/>
       <w:r>
         <w:rPr>
           <w:lang w:val="ru-RU"/>
         </w:rPr>
         <w:t>Володимирович</w:t>
       </w:r>
-      <w:proofErr w:type="spellEnd"/>
     </w:p>
     <w:p>
       <w:pPr>
@@ -464,7 +424,6 @@
                 <w:lang w:val="ru-RU"/>
               </w:rPr>
             </w:pPr>
-            <w:proofErr w:type="spellStart"/>
             <w:r>
               <w:rPr>
                 <w:rFonts w:ascii="Times New Roman" w:hAnsi="Times New Roman" w:cs="Times New Roman"/>
@@ -472,7 +431,6 @@
               </w:rPr>
               <w:t>Опис</w:t>
             </w:r>
-            <w:proofErr w:type="spellEnd"/>
           </w:p>
         </w:tc>
         <w:tc>
@@ -522,7 +480,6 @@
                 <w:lang w:val="ru-RU"/>
               </w:rPr>
             </w:pPr>
-            <w:proofErr w:type="spellStart"/>
             <w:r>
               <w:rPr>
                 <w:rFonts w:ascii="Times New Roman" w:hAnsi="Times New Roman" w:cs="Times New Roman"/>
@@ -530,7 +487,6 @@
               </w:rPr>
               <w:t>Коментарі</w:t>
             </w:r>
-            <w:proofErr w:type="spellEnd"/>
           </w:p>
         </w:tc>
       </w:tr>
@@ -603,23 +559,7 @@
                 <w:rFonts w:ascii="Times New Roman" w:hAnsi="Times New Roman" w:cs="Times New Roman"/>
                 <w:lang w:val="ru-RU"/>
               </w:rPr>
-              <w:t xml:space="preserve">Створено </w:t>
-            </w:r>
-            <w:proofErr w:type="spellStart"/>
-            <w:r>
-              <w:rPr>
-                <w:rFonts w:ascii="Times New Roman" w:hAnsi="Times New Roman" w:cs="Times New Roman"/>
-                <w:lang w:val="ru-RU"/>
-              </w:rPr>
-              <w:t>пункти</w:t>
-            </w:r>
-            <w:proofErr w:type="spellEnd"/>
-            <w:r>
-              <w:rPr>
-                <w:rFonts w:ascii="Times New Roman" w:hAnsi="Times New Roman" w:cs="Times New Roman"/>
-                <w:lang w:val="ru-RU"/>
-              </w:rPr>
-              <w:t xml:space="preserve"> 1.1-1.5</w:t>
+              <w:t>Створено пункти 1.1-1.5</w:t>
             </w:r>
           </w:p>
         </w:tc>
@@ -648,17 +588,8 @@
                 <w:rFonts w:ascii="Times New Roman" w:hAnsi="Times New Roman" w:cs="Times New Roman"/>
                 <w:lang w:val="ru-RU"/>
               </w:rPr>
-              <w:t xml:space="preserve">Захаров Антон </w:t>
+              <w:t>Захаров Антон Володимирович</w:t>
             </w:r>
-            <w:proofErr w:type="spellStart"/>
-            <w:r>
-              <w:rPr>
-                <w:rFonts w:ascii="Times New Roman" w:hAnsi="Times New Roman" w:cs="Times New Roman"/>
-                <w:lang w:val="ru-RU"/>
-              </w:rPr>
-              <w:t>Володимирович</w:t>
-            </w:r>
-            <w:proofErr w:type="spellEnd"/>
           </w:p>
         </w:tc>
         <w:tc>
@@ -751,23 +682,7 @@
                 <w:rFonts w:ascii="Times New Roman" w:hAnsi="Times New Roman" w:cs="Times New Roman"/>
                 <w:lang w:val="ru-RU"/>
               </w:rPr>
-              <w:t xml:space="preserve">Створено </w:t>
-            </w:r>
-            <w:proofErr w:type="spellStart"/>
-            <w:r>
-              <w:rPr>
-                <w:rFonts w:ascii="Times New Roman" w:hAnsi="Times New Roman" w:cs="Times New Roman"/>
-                <w:lang w:val="ru-RU"/>
-              </w:rPr>
-              <w:t>пункти</w:t>
-            </w:r>
-            <w:proofErr w:type="spellEnd"/>
-            <w:r>
-              <w:rPr>
-                <w:rFonts w:ascii="Times New Roman" w:hAnsi="Times New Roman" w:cs="Times New Roman"/>
-                <w:lang w:val="ru-RU"/>
-              </w:rPr>
-              <w:t xml:space="preserve"> 2.1-2.5</w:t>
+              <w:t>Створено пункти 2.1-2.5</w:t>
             </w:r>
           </w:p>
         </w:tc>
@@ -796,17 +711,8 @@
                 <w:rFonts w:ascii="Times New Roman" w:hAnsi="Times New Roman" w:cs="Times New Roman"/>
                 <w:lang w:val="ru-RU"/>
               </w:rPr>
-              <w:t xml:space="preserve">Захаров Антон </w:t>
+              <w:t>Захаров Антон Володимирович</w:t>
             </w:r>
-            <w:proofErr w:type="spellStart"/>
-            <w:r>
-              <w:rPr>
-                <w:rFonts w:ascii="Times New Roman" w:hAnsi="Times New Roman" w:cs="Times New Roman"/>
-                <w:lang w:val="ru-RU"/>
-              </w:rPr>
-              <w:t>Володимирович</w:t>
-            </w:r>
-            <w:proofErr w:type="spellEnd"/>
           </w:p>
         </w:tc>
         <w:tc>
@@ -899,23 +805,7 @@
                 <w:rFonts w:ascii="Times New Roman" w:hAnsi="Times New Roman" w:cs="Times New Roman"/>
                 <w:lang w:val="ru-RU"/>
               </w:rPr>
-              <w:t xml:space="preserve">Створено </w:t>
-            </w:r>
-            <w:proofErr w:type="spellStart"/>
-            <w:r>
-              <w:rPr>
-                <w:rFonts w:ascii="Times New Roman" w:hAnsi="Times New Roman" w:cs="Times New Roman"/>
-                <w:lang w:val="ru-RU"/>
-              </w:rPr>
-              <w:t>пункти</w:t>
-            </w:r>
-            <w:proofErr w:type="spellEnd"/>
-            <w:r>
-              <w:rPr>
-                <w:rFonts w:ascii="Times New Roman" w:hAnsi="Times New Roman" w:cs="Times New Roman"/>
-                <w:lang w:val="ru-RU"/>
-              </w:rPr>
-              <w:t xml:space="preserve"> 3.1-3.2</w:t>
+              <w:t>Створено пункти 3.1-3.2</w:t>
             </w:r>
           </w:p>
         </w:tc>
@@ -944,17 +834,8 @@
                 <w:rFonts w:ascii="Times New Roman" w:hAnsi="Times New Roman" w:cs="Times New Roman"/>
                 <w:lang w:val="ru-RU"/>
               </w:rPr>
-              <w:t xml:space="preserve">Захаров Антон </w:t>
+              <w:t>Захаров Антон Володимирович</w:t>
             </w:r>
-            <w:proofErr w:type="spellStart"/>
-            <w:r>
-              <w:rPr>
-                <w:rFonts w:ascii="Times New Roman" w:hAnsi="Times New Roman" w:cs="Times New Roman"/>
-                <w:lang w:val="ru-RU"/>
-              </w:rPr>
-              <w:t>Володимирович</w:t>
-            </w:r>
-            <w:proofErr w:type="spellEnd"/>
           </w:p>
         </w:tc>
         <w:tc>
@@ -1047,23 +928,7 @@
                 <w:rFonts w:ascii="Times New Roman" w:hAnsi="Times New Roman" w:cs="Times New Roman"/>
                 <w:lang w:val="ru-RU"/>
               </w:rPr>
-              <w:t xml:space="preserve">Створено </w:t>
-            </w:r>
-            <w:proofErr w:type="spellStart"/>
-            <w:r>
-              <w:rPr>
-                <w:rFonts w:ascii="Times New Roman" w:hAnsi="Times New Roman" w:cs="Times New Roman"/>
-                <w:lang w:val="ru-RU"/>
-              </w:rPr>
-              <w:t>пункти</w:t>
-            </w:r>
-            <w:proofErr w:type="spellEnd"/>
-            <w:r>
-              <w:rPr>
-                <w:rFonts w:ascii="Times New Roman" w:hAnsi="Times New Roman" w:cs="Times New Roman"/>
-                <w:lang w:val="ru-RU"/>
-              </w:rPr>
-              <w:t xml:space="preserve"> 3.3-3.5</w:t>
+              <w:t>Створено пункти 3.3-3.5</w:t>
             </w:r>
           </w:p>
         </w:tc>
@@ -1092,17 +957,8 @@
                 <w:rFonts w:ascii="Times New Roman" w:hAnsi="Times New Roman" w:cs="Times New Roman"/>
                 <w:lang w:val="ru-RU"/>
               </w:rPr>
-              <w:t xml:space="preserve">Захаров Антон </w:t>
+              <w:t>Захаров Антон Володимирович</w:t>
             </w:r>
-            <w:proofErr w:type="spellStart"/>
-            <w:r>
-              <w:rPr>
-                <w:rFonts w:ascii="Times New Roman" w:hAnsi="Times New Roman" w:cs="Times New Roman"/>
-                <w:lang w:val="ru-RU"/>
-              </w:rPr>
-              <w:t>Володимирович</w:t>
-            </w:r>
-            <w:proofErr w:type="spellEnd"/>
           </w:p>
         </w:tc>
         <w:tc>
@@ -1248,7 +1104,6 @@
         </w:rPr>
         <w:t>“</w:t>
       </w:r>
-      <w:proofErr w:type="spellStart"/>
       <w:r>
         <w:rPr>
           <w:rFonts w:eastAsia="Arial Unicode MS"/>
@@ -1260,7 +1115,6 @@
         </w:rPr>
         <w:t>VisualEyes</w:t>
       </w:r>
-      <w:proofErr w:type="spellEnd"/>
       <w:r>
         <w:rPr>
           <w:rFonts w:eastAsia="Arial Unicode MS"/>
@@ -1307,10 +1161,15 @@
           <w:szCs w:val="28"/>
           <w:bdr w:val="nil"/>
         </w:rPr>
-        <w:t xml:space="preserve">Користувач платформи може шукати товари або додавати їх у персональний </w:t>
-      </w:r>
-      <w:proofErr w:type="spellStart"/>
-      <w:r>
+        <w:t>Користувач платформи може шукати товари або додавати їх у персональний трекер. У фоновому режимі система використовує підсистему Smart Scraper для динамічного обходу цільових веб-ресурсів (SPA-застосунків), збирає актуальні ціни та зберігає їх у вигляді часових рядів. Програмний продукт забезпечує зручний вебінтерфейс (дашборд) з інтерактивними графіками історії цін. Архітектура побудована за монолітною клієнт-серверною моделлю з використанням Node.js, React та реляційної бази даних PostgreSQL.</w:t>
+      </w:r>
+    </w:p>
+    <w:p>
+      <w:pPr>
+        <w:pStyle w:val="NormalWeb"/>
+        <w:spacing w:before="0" w:beforeAutospacing="0" w:after="0" w:afterAutospacing="0" w:line="360" w:lineRule="auto"/>
+        <w:ind w:firstLine="720"/>
+        <w:jc w:val="both"/>
         <w:rPr>
           <w:rFonts w:eastAsia="Arial Unicode MS"/>
           <w:color w:val="000000"/>
@@ -1319,9 +1178,7 @@
           <w:szCs w:val="28"/>
           <w:bdr w:val="nil"/>
         </w:rPr>
-        <w:t>трекер</w:t>
-      </w:r>
-      <w:proofErr w:type="spellEnd"/>
+      </w:pPr>
       <w:r>
         <w:rPr>
           <w:rFonts w:eastAsia="Arial Unicode MS"/>
@@ -1331,10 +1188,15 @@
           <w:szCs w:val="28"/>
           <w:bdr w:val="nil"/>
         </w:rPr>
-        <w:t xml:space="preserve">. У фоновому режимі система використовує підсистему </w:t>
-      </w:r>
-      <w:proofErr w:type="spellStart"/>
-      <w:r>
+        <w:t>1.2 Мета</w:t>
+      </w:r>
+    </w:p>
+    <w:p>
+      <w:pPr>
+        <w:pStyle w:val="NormalWeb"/>
+        <w:spacing w:before="0" w:beforeAutospacing="0" w:after="0" w:afterAutospacing="0" w:line="360" w:lineRule="auto"/>
+        <w:ind w:firstLine="360"/>
+        <w:jc w:val="both"/>
         <w:rPr>
           <w:rFonts w:eastAsia="Arial Unicode MS"/>
           <w:color w:val="000000"/>
@@ -1343,9 +1205,7 @@
           <w:szCs w:val="28"/>
           <w:bdr w:val="nil"/>
         </w:rPr>
-        <w:t>Smart</w:t>
-      </w:r>
-      <w:proofErr w:type="spellEnd"/>
+      </w:pPr>
       <w:r>
         <w:rPr>
           <w:rFonts w:eastAsia="Arial Unicode MS"/>
@@ -1355,10 +1215,86 @@
           <w:szCs w:val="28"/>
           <w:bdr w:val="nil"/>
         </w:rPr>
-        <w:t xml:space="preserve"> </w:t>
-      </w:r>
-      <w:proofErr w:type="spellStart"/>
-      <w:r>
+        <w:t>Метою розробки даного програмного забезпечення є створення незалежного аналітичного інструменту, який дозволяє відстежувати реальну динаміку цін на ринку електронної комерції. Система має забезпечити:</w:t>
+      </w:r>
+    </w:p>
+    <w:p>
+      <w:pPr>
+        <w:pStyle w:val="Bullet"/>
+        <w:rPr>
+          <w:bdr w:val="nil"/>
+        </w:rPr>
+      </w:pPr>
+      <w:r>
+        <w:rPr>
+          <w:bdr w:val="nil"/>
+        </w:rPr>
+        <w:lastRenderedPageBreak/>
+        <w:t>автоматизований збір даних з вебсторінок інтернет-магазинів, незважаючи на динамічний рендеринг контенту;</w:t>
+      </w:r>
+    </w:p>
+    <w:p>
+      <w:pPr>
+        <w:pStyle w:val="Bullet"/>
+        <w:rPr>
+          <w:bdr w:val="nil"/>
+        </w:rPr>
+      </w:pPr>
+      <w:r>
+        <w:rPr>
+          <w:bdr w:val="nil"/>
+        </w:rPr>
+        <w:t>обхід систем захисту (WAF) за допомогою імітації поведінки реального користувача;</w:t>
+      </w:r>
+    </w:p>
+    <w:p>
+      <w:pPr>
+        <w:pStyle w:val="Bullet"/>
+        <w:rPr>
+          <w:bdr w:val="nil"/>
+        </w:rPr>
+      </w:pPr>
+      <w:r>
+        <w:rPr>
+          <w:bdr w:val="nil"/>
+        </w:rPr>
+        <w:t>нормалізацію зібраних даних та усунення дублікатів;</w:t>
+      </w:r>
+    </w:p>
+    <w:p>
+      <w:pPr>
+        <w:pStyle w:val="Bullet"/>
+        <w:rPr>
+          <w:bdr w:val="nil"/>
+        </w:rPr>
+      </w:pPr>
+      <w:r>
+        <w:rPr>
+          <w:bdr w:val="nil"/>
+        </w:rPr>
+        <w:t>збереження історичних даних (часових рядів) для побудови графіків;</w:t>
+      </w:r>
+    </w:p>
+    <w:p>
+      <w:pPr>
+        <w:pStyle w:val="Bullet"/>
+        <w:rPr>
+          <w:bdr w:val="nil"/>
+        </w:rPr>
+      </w:pPr>
+      <w:r>
+        <w:rPr>
+          <w:bdr w:val="nil"/>
+        </w:rPr>
+        <w:t>надання користувачам зручного інтерфейсу для аналізу цінових маніпуляцій.</w:t>
+      </w:r>
+    </w:p>
+    <w:p>
+      <w:pPr>
+        <w:pStyle w:val="NormalWeb"/>
+        <w:spacing w:before="0" w:beforeAutospacing="0" w:after="0" w:afterAutospacing="0" w:line="360" w:lineRule="auto"/>
+        <w:ind w:firstLine="709"/>
+        <w:jc w:val="both"/>
         <w:rPr>
           <w:rFonts w:eastAsia="Arial Unicode MS"/>
           <w:color w:val="000000"/>
@@ -1367,9 +1303,7 @@
           <w:szCs w:val="28"/>
           <w:bdr w:val="nil"/>
         </w:rPr>
-        <w:t>Scraper</w:t>
-      </w:r>
-      <w:proofErr w:type="spellEnd"/>
+      </w:pPr>
       <w:r>
         <w:rPr>
           <w:rFonts w:eastAsia="Arial Unicode MS"/>
@@ -1379,10 +1313,15 @@
           <w:szCs w:val="28"/>
           <w:bdr w:val="nil"/>
         </w:rPr>
-        <w:t xml:space="preserve"> для динамічного обходу цільових веб-ресурсів (SPA-застосунків), збирає актуальні ціни та зберігає їх у вигляді часових рядів. Програмний продукт забезпечує зручний </w:t>
-      </w:r>
-      <w:proofErr w:type="spellStart"/>
-      <w:r>
+        <w:t>1.3 Межі</w:t>
+      </w:r>
+    </w:p>
+    <w:p>
+      <w:pPr>
+        <w:pStyle w:val="NormalWeb"/>
+        <w:spacing w:before="0" w:beforeAutospacing="0" w:after="0" w:afterAutospacing="0" w:line="360" w:lineRule="auto"/>
+        <w:ind w:firstLine="709"/>
+        <w:jc w:val="both"/>
         <w:rPr>
           <w:rFonts w:eastAsia="Arial Unicode MS"/>
           <w:color w:val="000000"/>
@@ -1391,9 +1330,7 @@
           <w:szCs w:val="28"/>
           <w:bdr w:val="nil"/>
         </w:rPr>
-        <w:t>вебінтерфейс</w:t>
-      </w:r>
-      <w:proofErr w:type="spellEnd"/>
+      </w:pPr>
       <w:r>
         <w:rPr>
           <w:rFonts w:eastAsia="Arial Unicode MS"/>
@@ -1403,10 +1340,126 @@
           <w:szCs w:val="28"/>
           <w:bdr w:val="nil"/>
         </w:rPr>
-        <w:t xml:space="preserve"> (</w:t>
-      </w:r>
-      <w:proofErr w:type="spellStart"/>
-      <w:r>
+        <w:t>Основними функціональними межами системи є:</w:t>
+      </w:r>
+    </w:p>
+    <w:p>
+      <w:pPr>
+        <w:pStyle w:val="Bullet"/>
+        <w:rPr>
+          <w:bdr w:val="nil"/>
+        </w:rPr>
+      </w:pPr>
+      <w:r>
+        <w:rPr>
+          <w:bdr w:val="nil"/>
+        </w:rPr>
+        <w:t>джерело даних</w:t>
+      </w:r>
+      <w:r>
+        <w:rPr>
+          <w:bdr w:val="nil"/>
+          <w:lang w:val="ru-RU"/>
+        </w:rPr>
+        <w:t xml:space="preserve"> </w:t>
+      </w:r>
+      <w:r>
+        <w:t>–</w:t>
+      </w:r>
+      <w:r>
+        <w:rPr>
+          <w:bdr w:val="nil"/>
+        </w:rPr>
+        <w:t xml:space="preserve"> вебсторінки обраних українських торгових мереж та маркетплейсів. Система не використовує офіційні API магазинів (через їх закритість або платність), а покладається на веб-скрапінг;</w:t>
+      </w:r>
+    </w:p>
+    <w:p>
+      <w:pPr>
+        <w:pStyle w:val="Bullet"/>
+        <w:rPr>
+          <w:bdr w:val="nil"/>
+        </w:rPr>
+      </w:pPr>
+      <w:r>
+        <w:rPr>
+          <w:bdr w:val="nil"/>
+        </w:rPr>
+        <w:t xml:space="preserve">архітектурна модель </w:t>
+      </w:r>
+      <w:r>
+        <w:t>–</w:t>
+      </w:r>
+      <w:r>
+        <w:t xml:space="preserve"> </w:t>
+      </w:r>
+      <w:r>
+        <w:rPr>
+          <w:bdr w:val="nil"/>
+        </w:rPr>
+        <w:t>монолітний бекенд, що виконує як функції обслуговування API, так і фоновий парсинг. Розподіл на мікросервіси на поточному етапі не передбачено;</w:t>
+      </w:r>
+    </w:p>
+    <w:p>
+      <w:pPr>
+        <w:pStyle w:val="Bullet"/>
+        <w:rPr>
+          <w:bdr w:val="nil"/>
+        </w:rPr>
+      </w:pPr>
+      <w:r>
+        <w:rPr>
+          <w:bdr w:val="nil"/>
+        </w:rPr>
+        <w:t xml:space="preserve">формат даних </w:t>
+      </w:r>
+      <w:r>
+        <w:t>–</w:t>
+      </w:r>
+      <w:r>
+        <w:rPr>
+          <w:lang w:val="ru-RU"/>
+        </w:rPr>
+        <w:t xml:space="preserve"> </w:t>
+      </w:r>
+      <w:r>
+        <w:rPr>
+          <w:bdr w:val="nil"/>
+        </w:rPr>
+        <w:t>відстежуються лише числові та текстові параметри товарів (ціна, наявність знижки, назва, артикул). Аналіз відгуків або зображень не входить у поточні межі;</w:t>
+      </w:r>
+    </w:p>
+    <w:p>
+      <w:pPr>
+        <w:pStyle w:val="Bullet"/>
+        <w:rPr>
+          <w:bdr w:val="nil"/>
+        </w:rPr>
+      </w:pPr>
+      <w:r>
+        <w:rPr>
+          <w:bdr w:val="nil"/>
+        </w:rPr>
+        <w:t xml:space="preserve">інтеграції </w:t>
+      </w:r>
+      <w:r>
+        <w:t>–</w:t>
+      </w:r>
+      <w:r>
+        <w:t xml:space="preserve"> </w:t>
+      </w:r>
+      <w:r>
+        <w:rPr>
+          <w:bdr w:val="nil"/>
+        </w:rPr>
+        <w:t>не передбачено прямої інтеграції із зовнішніми ERP або CRM системами інтернет-магазинів.</w:t>
+      </w:r>
+    </w:p>
+    <w:p>
+      <w:pPr>
+        <w:pStyle w:val="NormalWeb"/>
+        <w:spacing w:before="0" w:beforeAutospacing="0" w:after="0" w:afterAutospacing="0" w:line="360" w:lineRule="auto"/>
+        <w:ind w:firstLine="709"/>
+        <w:jc w:val="both"/>
         <w:rPr>
           <w:rFonts w:eastAsia="Arial Unicode MS"/>
           <w:color w:val="000000"/>
@@ -1415,9 +1468,7 @@
           <w:szCs w:val="28"/>
           <w:bdr w:val="nil"/>
         </w:rPr>
-        <w:t>дашборд</w:t>
-      </w:r>
-      <w:proofErr w:type="spellEnd"/>
+      </w:pPr>
       <w:r>
         <w:rPr>
           <w:rFonts w:eastAsia="Arial Unicode MS"/>
@@ -1427,10 +1478,15 @@
           <w:szCs w:val="28"/>
           <w:bdr w:val="nil"/>
         </w:rPr>
-        <w:t xml:space="preserve">) з інтерактивними графіками історії цін. Архітектура побудована за монолітною клієнт-серверною моделлю з використанням Node.js, </w:t>
-      </w:r>
-      <w:proofErr w:type="spellStart"/>
-      <w:r>
+        <w:t>1.4 Посилання</w:t>
+      </w:r>
+    </w:p>
+    <w:p>
+      <w:pPr>
+        <w:pStyle w:val="NormalWeb"/>
+        <w:spacing w:before="0" w:beforeAutospacing="0" w:after="0" w:afterAutospacing="0" w:line="360" w:lineRule="auto"/>
+        <w:ind w:firstLine="709"/>
+        <w:jc w:val="both"/>
         <w:rPr>
           <w:rFonts w:eastAsia="Arial Unicode MS"/>
           <w:color w:val="000000"/>
@@ -1439,9 +1495,7 @@
           <w:szCs w:val="28"/>
           <w:bdr w:val="nil"/>
         </w:rPr>
-        <w:t>React</w:t>
-      </w:r>
-      <w:proofErr w:type="spellEnd"/>
+      </w:pPr>
       <w:r>
         <w:rPr>
           <w:rFonts w:eastAsia="Arial Unicode MS"/>
@@ -1451,85 +1505,7 @@
           <w:szCs w:val="28"/>
           <w:bdr w:val="nil"/>
         </w:rPr>
-        <w:t xml:space="preserve"> та реляційної бази даних </w:t>
-      </w:r>
-      <w:proofErr w:type="spellStart"/>
-      <w:r>
-        <w:rPr>
-          <w:rFonts w:eastAsia="Arial Unicode MS"/>
-          <w:color w:val="000000"/>
-          <w:kern w:val="2"/>
-          <w:sz w:val="28"/>
-          <w:szCs w:val="28"/>
-          <w:bdr w:val="nil"/>
-        </w:rPr>
-        <w:t>PostgreSQL</w:t>
-      </w:r>
-      <w:proofErr w:type="spellEnd"/>
-      <w:r>
-        <w:rPr>
-          <w:rFonts w:eastAsia="Arial Unicode MS"/>
-          <w:color w:val="000000"/>
-          <w:kern w:val="2"/>
-          <w:sz w:val="28"/>
-          <w:szCs w:val="28"/>
-          <w:bdr w:val="nil"/>
-        </w:rPr>
-        <w:t>.</w:t>
-      </w:r>
-    </w:p>
-    <w:p>
-      <w:pPr>
-        <w:pStyle w:val="NormalWeb"/>
-        <w:spacing w:before="0" w:beforeAutospacing="0" w:after="0" w:afterAutospacing="0" w:line="360" w:lineRule="auto"/>
-        <w:ind w:firstLine="720"/>
-        <w:jc w:val="both"/>
-        <w:rPr>
-          <w:rFonts w:eastAsia="Arial Unicode MS"/>
-          <w:color w:val="000000"/>
-          <w:kern w:val="2"/>
-          <w:sz w:val="28"/>
-          <w:szCs w:val="28"/>
-          <w:bdr w:val="nil"/>
-        </w:rPr>
-      </w:pPr>
-      <w:r>
-        <w:rPr>
-          <w:rFonts w:eastAsia="Arial Unicode MS"/>
-          <w:color w:val="000000"/>
-          <w:kern w:val="2"/>
-          <w:sz w:val="28"/>
-          <w:szCs w:val="28"/>
-          <w:bdr w:val="nil"/>
-        </w:rPr>
-        <w:t>1.2 Мета</w:t>
-      </w:r>
-    </w:p>
-    <w:p>
-      <w:pPr>
-        <w:pStyle w:val="NormalWeb"/>
-        <w:spacing w:before="0" w:beforeAutospacing="0" w:after="0" w:afterAutospacing="0" w:line="360" w:lineRule="auto"/>
-        <w:ind w:firstLine="360"/>
-        <w:jc w:val="both"/>
-        <w:rPr>
-          <w:rFonts w:eastAsia="Arial Unicode MS"/>
-          <w:color w:val="000000"/>
-          <w:kern w:val="2"/>
-          <w:sz w:val="28"/>
-          <w:szCs w:val="28"/>
-          <w:bdr w:val="nil"/>
-        </w:rPr>
-      </w:pPr>
-      <w:r>
-        <w:rPr>
-          <w:rFonts w:eastAsia="Arial Unicode MS"/>
-          <w:color w:val="000000"/>
-          <w:kern w:val="2"/>
-          <w:sz w:val="28"/>
-          <w:szCs w:val="28"/>
-          <w:bdr w:val="nil"/>
-        </w:rPr>
-        <w:t>Метою розробки даного програмного забезпечення є створення незалежного аналітичного інструменту, який дозволяє відстежувати реальну динаміку цін на ринку електронної комерції. Система має забезпечити:</w:t>
+        <w:t>У процесі створення цього документа та розробки програмного продукту були використані наступні джерела:</w:t>
       </w:r>
     </w:p>
     <w:p>
@@ -1543,423 +1519,7 @@
         <w:rPr>
           <w:bdr w:val="nil"/>
         </w:rPr>
-        <w:lastRenderedPageBreak/>
-        <w:t xml:space="preserve">автоматизований збір даних з </w:t>
-      </w:r>
-      <w:proofErr w:type="spellStart"/>
-      <w:r>
-        <w:rPr>
-          <w:bdr w:val="nil"/>
-        </w:rPr>
-        <w:t>вебсторінок</w:t>
-      </w:r>
-      <w:proofErr w:type="spellEnd"/>
-      <w:r>
-        <w:rPr>
-          <w:bdr w:val="nil"/>
-        </w:rPr>
-        <w:t xml:space="preserve"> інтернет-магазинів, незважаючи на динамічний </w:t>
-      </w:r>
-      <w:proofErr w:type="spellStart"/>
-      <w:r>
-        <w:rPr>
-          <w:bdr w:val="nil"/>
-        </w:rPr>
-        <w:t>рендеринг</w:t>
-      </w:r>
-      <w:proofErr w:type="spellEnd"/>
-      <w:r>
-        <w:rPr>
-          <w:bdr w:val="nil"/>
-        </w:rPr>
-        <w:t xml:space="preserve"> контенту;</w:t>
-      </w:r>
-    </w:p>
-    <w:p>
-      <w:pPr>
-        <w:pStyle w:val="Bullet"/>
-        <w:rPr>
-          <w:bdr w:val="nil"/>
-        </w:rPr>
-      </w:pPr>
-      <w:r>
-        <w:rPr>
-          <w:bdr w:val="nil"/>
-        </w:rPr>
-        <w:t>обхід систем захисту (WAF) за допомогою імітації поведінки реального користувача;</w:t>
-      </w:r>
-    </w:p>
-    <w:p>
-      <w:pPr>
-        <w:pStyle w:val="Bullet"/>
-        <w:rPr>
-          <w:bdr w:val="nil"/>
-        </w:rPr>
-      </w:pPr>
-      <w:r>
-        <w:rPr>
-          <w:bdr w:val="nil"/>
-        </w:rPr>
-        <w:t>нормалізацію зібраних даних та усунення дублікатів;</w:t>
-      </w:r>
-    </w:p>
-    <w:p>
-      <w:pPr>
-        <w:pStyle w:val="Bullet"/>
-        <w:rPr>
-          <w:bdr w:val="nil"/>
-        </w:rPr>
-      </w:pPr>
-      <w:r>
-        <w:rPr>
-          <w:bdr w:val="nil"/>
-        </w:rPr>
-        <w:t>збереження історичних даних (часових рядів) для побудови графіків;</w:t>
-      </w:r>
-    </w:p>
-    <w:p>
-      <w:pPr>
-        <w:pStyle w:val="Bullet"/>
-        <w:rPr>
-          <w:bdr w:val="nil"/>
-        </w:rPr>
-      </w:pPr>
-      <w:r>
-        <w:rPr>
-          <w:bdr w:val="nil"/>
-        </w:rPr>
-        <w:t>надання користувачам зручного інтерфейсу для аналізу цінових маніпуляцій.</w:t>
-      </w:r>
-    </w:p>
-    <w:p>
-      <w:pPr>
-        <w:pStyle w:val="NormalWeb"/>
-        <w:spacing w:before="0" w:beforeAutospacing="0" w:after="0" w:afterAutospacing="0" w:line="360" w:lineRule="auto"/>
-        <w:ind w:firstLine="709"/>
-        <w:jc w:val="both"/>
-        <w:rPr>
-          <w:rFonts w:eastAsia="Arial Unicode MS"/>
-          <w:color w:val="000000"/>
-          <w:kern w:val="2"/>
-          <w:sz w:val="28"/>
-          <w:szCs w:val="28"/>
-          <w:bdr w:val="nil"/>
-        </w:rPr>
-      </w:pPr>
-      <w:r>
-        <w:rPr>
-          <w:rFonts w:eastAsia="Arial Unicode MS"/>
-          <w:color w:val="000000"/>
-          <w:kern w:val="2"/>
-          <w:sz w:val="28"/>
-          <w:szCs w:val="28"/>
-          <w:bdr w:val="nil"/>
-        </w:rPr>
-        <w:t>1.3 Межі</w:t>
-      </w:r>
-    </w:p>
-    <w:p>
-      <w:pPr>
-        <w:pStyle w:val="NormalWeb"/>
-        <w:spacing w:before="0" w:beforeAutospacing="0" w:after="0" w:afterAutospacing="0" w:line="360" w:lineRule="auto"/>
-        <w:ind w:firstLine="709"/>
-        <w:jc w:val="both"/>
-        <w:rPr>
-          <w:rFonts w:eastAsia="Arial Unicode MS"/>
-          <w:color w:val="000000"/>
-          <w:kern w:val="2"/>
-          <w:sz w:val="28"/>
-          <w:szCs w:val="28"/>
-          <w:bdr w:val="nil"/>
-        </w:rPr>
-      </w:pPr>
-      <w:r>
-        <w:rPr>
-          <w:rFonts w:eastAsia="Arial Unicode MS"/>
-          <w:color w:val="000000"/>
-          <w:kern w:val="2"/>
-          <w:sz w:val="28"/>
-          <w:szCs w:val="28"/>
-          <w:bdr w:val="nil"/>
-        </w:rPr>
-        <w:t>Основними функціональними межами системи є:</w:t>
-      </w:r>
-    </w:p>
-    <w:p>
-      <w:pPr>
-        <w:pStyle w:val="Bullet"/>
-        <w:rPr>
-          <w:bdr w:val="nil"/>
-        </w:rPr>
-      </w:pPr>
-      <w:r>
-        <w:rPr>
-          <w:bdr w:val="nil"/>
-        </w:rPr>
-        <w:t>джерело даних</w:t>
-      </w:r>
-      <w:r>
-        <w:rPr>
-          <w:bdr w:val="nil"/>
-          <w:lang w:val="ru-RU"/>
-        </w:rPr>
-        <w:t xml:space="preserve"> </w:t>
-      </w:r>
-      <w:r>
-        <w:t>–</w:t>
-      </w:r>
-      <w:r>
-        <w:rPr>
-          <w:bdr w:val="nil"/>
-        </w:rPr>
-        <w:t xml:space="preserve"> </w:t>
-      </w:r>
-      <w:proofErr w:type="spellStart"/>
-      <w:r>
-        <w:rPr>
-          <w:bdr w:val="nil"/>
-        </w:rPr>
-        <w:t>вебсторінки</w:t>
-      </w:r>
-      <w:proofErr w:type="spellEnd"/>
-      <w:r>
-        <w:rPr>
-          <w:bdr w:val="nil"/>
-        </w:rPr>
-        <w:t xml:space="preserve"> обраних українських торгових мереж та </w:t>
-      </w:r>
-      <w:proofErr w:type="spellStart"/>
-      <w:r>
-        <w:rPr>
-          <w:bdr w:val="nil"/>
-        </w:rPr>
-        <w:t>маркетплейсів</w:t>
-      </w:r>
-      <w:proofErr w:type="spellEnd"/>
-      <w:r>
-        <w:rPr>
-          <w:bdr w:val="nil"/>
-        </w:rPr>
-        <w:t>. Система не використовує офіційні API магазинів (через їх закритість або платність), а покладається на веб-</w:t>
-      </w:r>
-      <w:proofErr w:type="spellStart"/>
-      <w:r>
-        <w:rPr>
-          <w:bdr w:val="nil"/>
-        </w:rPr>
-        <w:t>скрапінг</w:t>
-      </w:r>
-      <w:proofErr w:type="spellEnd"/>
-      <w:r>
-        <w:rPr>
-          <w:bdr w:val="nil"/>
-        </w:rPr>
-        <w:t>;</w:t>
-      </w:r>
-    </w:p>
-    <w:p>
-      <w:pPr>
-        <w:pStyle w:val="Bullet"/>
-        <w:rPr>
-          <w:bdr w:val="nil"/>
-        </w:rPr>
-      </w:pPr>
-      <w:r>
-        <w:rPr>
-          <w:bdr w:val="nil"/>
-        </w:rPr>
-        <w:t xml:space="preserve">архітектурна модель </w:t>
-      </w:r>
-      <w:r>
-        <w:t>–</w:t>
-      </w:r>
-      <w:r>
-        <w:t xml:space="preserve"> </w:t>
-      </w:r>
-      <w:r>
-        <w:rPr>
-          <w:bdr w:val="nil"/>
-        </w:rPr>
-        <w:t xml:space="preserve">монолітний </w:t>
-      </w:r>
-      <w:proofErr w:type="spellStart"/>
-      <w:r>
-        <w:rPr>
-          <w:bdr w:val="nil"/>
-        </w:rPr>
-        <w:t>бекенд</w:t>
-      </w:r>
-      <w:proofErr w:type="spellEnd"/>
-      <w:r>
-        <w:rPr>
-          <w:bdr w:val="nil"/>
-        </w:rPr>
-        <w:t xml:space="preserve">, що виконує як функції обслуговування API, так і фоновий </w:t>
-      </w:r>
-      <w:proofErr w:type="spellStart"/>
-      <w:r>
-        <w:rPr>
-          <w:bdr w:val="nil"/>
-        </w:rPr>
-        <w:t>парсинг</w:t>
-      </w:r>
-      <w:proofErr w:type="spellEnd"/>
-      <w:r>
-        <w:rPr>
-          <w:bdr w:val="nil"/>
-        </w:rPr>
-        <w:t xml:space="preserve">. Розподіл на </w:t>
-      </w:r>
-      <w:proofErr w:type="spellStart"/>
-      <w:r>
-        <w:rPr>
-          <w:bdr w:val="nil"/>
-        </w:rPr>
-        <w:t>мікросервіси</w:t>
-      </w:r>
-      <w:proofErr w:type="spellEnd"/>
-      <w:r>
-        <w:rPr>
-          <w:bdr w:val="nil"/>
-        </w:rPr>
-        <w:t xml:space="preserve"> на поточному етапі не передбачено;</w:t>
-      </w:r>
-    </w:p>
-    <w:p>
-      <w:pPr>
-        <w:pStyle w:val="Bullet"/>
-        <w:rPr>
-          <w:bdr w:val="nil"/>
-        </w:rPr>
-      </w:pPr>
-      <w:r>
-        <w:rPr>
-          <w:bdr w:val="nil"/>
-        </w:rPr>
-        <w:t xml:space="preserve">формат даних </w:t>
-      </w:r>
-      <w:r>
-        <w:t>–</w:t>
-      </w:r>
-      <w:r>
-        <w:rPr>
-          <w:lang w:val="ru-RU"/>
-        </w:rPr>
-        <w:t xml:space="preserve"> </w:t>
-      </w:r>
-      <w:r>
-        <w:rPr>
-          <w:bdr w:val="nil"/>
-        </w:rPr>
-        <w:t>відстежуються лише числові та текстові параметри товарів (ціна, наявність знижки, назва, артикул). Аналіз відгуків або зображень не входить у поточні межі;</w:t>
-      </w:r>
-    </w:p>
-    <w:p>
-      <w:pPr>
-        <w:pStyle w:val="Bullet"/>
-        <w:rPr>
-          <w:bdr w:val="nil"/>
-        </w:rPr>
-      </w:pPr>
-      <w:r>
-        <w:rPr>
-          <w:bdr w:val="nil"/>
-        </w:rPr>
-        <w:t xml:space="preserve">інтеграції </w:t>
-      </w:r>
-      <w:r>
-        <w:t>–</w:t>
-      </w:r>
-      <w:r>
-        <w:t xml:space="preserve"> </w:t>
-      </w:r>
-      <w:r>
-        <w:rPr>
-          <w:bdr w:val="nil"/>
-        </w:rPr>
-        <w:t>не передбачено прямої інтеграції із зовнішніми ERP або CRM системами інтернет-магазинів.</w:t>
-      </w:r>
-    </w:p>
-    <w:p>
-      <w:pPr>
-        <w:pStyle w:val="NormalWeb"/>
-        <w:spacing w:before="0" w:beforeAutospacing="0" w:after="0" w:afterAutospacing="0" w:line="360" w:lineRule="auto"/>
-        <w:ind w:firstLine="709"/>
-        <w:jc w:val="both"/>
-        <w:rPr>
-          <w:rFonts w:eastAsia="Arial Unicode MS"/>
-          <w:color w:val="000000"/>
-          <w:kern w:val="2"/>
-          <w:sz w:val="28"/>
-          <w:szCs w:val="28"/>
-          <w:bdr w:val="nil"/>
-        </w:rPr>
-      </w:pPr>
-      <w:r>
-        <w:rPr>
-          <w:rFonts w:eastAsia="Arial Unicode MS"/>
-          <w:color w:val="000000"/>
-          <w:kern w:val="2"/>
-          <w:sz w:val="28"/>
-          <w:szCs w:val="28"/>
-          <w:bdr w:val="nil"/>
-        </w:rPr>
-        <w:t>1.4 Посилання</w:t>
-      </w:r>
-    </w:p>
-    <w:p>
-      <w:pPr>
-        <w:pStyle w:val="NormalWeb"/>
-        <w:spacing w:before="0" w:beforeAutospacing="0" w:after="0" w:afterAutospacing="0" w:line="360" w:lineRule="auto"/>
-        <w:ind w:firstLine="709"/>
-        <w:jc w:val="both"/>
-        <w:rPr>
-          <w:rFonts w:eastAsia="Arial Unicode MS"/>
-          <w:color w:val="000000"/>
-          <w:kern w:val="2"/>
-          <w:sz w:val="28"/>
-          <w:szCs w:val="28"/>
-          <w:bdr w:val="nil"/>
-        </w:rPr>
-      </w:pPr>
-      <w:r>
-        <w:rPr>
-          <w:rFonts w:eastAsia="Arial Unicode MS"/>
-          <w:color w:val="000000"/>
-          <w:kern w:val="2"/>
-          <w:sz w:val="28"/>
-          <w:szCs w:val="28"/>
-          <w:bdr w:val="nil"/>
-        </w:rPr>
-        <w:t>У процесі створення цього документа та розробки програмного продукту були використані наступні джерела:</w:t>
-      </w:r>
-    </w:p>
-    <w:p>
-      <w:pPr>
-        <w:pStyle w:val="Bullet"/>
-        <w:rPr>
-          <w:bdr w:val="nil"/>
-        </w:rPr>
-      </w:pPr>
-      <w:r>
-        <w:rPr>
-          <w:bdr w:val="nil"/>
-        </w:rPr>
-        <w:t xml:space="preserve">Node.js </w:t>
-      </w:r>
-      <w:proofErr w:type="spellStart"/>
-      <w:r>
-        <w:rPr>
-          <w:bdr w:val="nil"/>
-        </w:rPr>
-        <w:t>Documentation</w:t>
-      </w:r>
-      <w:proofErr w:type="spellEnd"/>
-      <w:r>
-        <w:rPr>
-          <w:bdr w:val="nil"/>
-        </w:rPr>
-        <w:t xml:space="preserve">. URL: </w:t>
+        <w:t xml:space="preserve">Node.js Documentation. URL: </w:t>
       </w:r>
       <w:hyperlink r:id="rId8" w:tgtFrame="_blank" w:history="1">
         <w:r>
@@ -1983,19 +1543,11 @@
           <w:bdr w:val="nil"/>
         </w:rPr>
       </w:pPr>
-      <w:proofErr w:type="spellStart"/>
-      <w:r>
-        <w:rPr>
-          <w:bdr w:val="nil"/>
-        </w:rPr>
-        <w:t>Puppeteer</w:t>
-      </w:r>
-      <w:proofErr w:type="spellEnd"/>
-      <w:r>
-        <w:rPr>
-          <w:bdr w:val="nil"/>
-        </w:rPr>
-        <w:t xml:space="preserve"> API. URL: </w:t>
+      <w:r>
+        <w:rPr>
+          <w:bdr w:val="nil"/>
+        </w:rPr>
+        <w:t xml:space="preserve">Puppeteer API. URL: </w:t>
       </w:r>
       <w:hyperlink r:id="rId9" w:tgtFrame="_blank" w:history="1">
         <w:r>
@@ -2019,117 +1571,11 @@
           <w:bdr w:val="nil"/>
         </w:rPr>
       </w:pPr>
-      <w:proofErr w:type="spellStart"/>
-      <w:r>
-        <w:rPr>
-          <w:bdr w:val="nil"/>
-        </w:rPr>
-        <w:t>PostgreSQL</w:t>
-      </w:r>
-      <w:proofErr w:type="spellEnd"/>
-      <w:r>
-        <w:rPr>
-          <w:bdr w:val="nil"/>
-        </w:rPr>
-        <w:t xml:space="preserve">: </w:t>
-      </w:r>
-      <w:proofErr w:type="spellStart"/>
-      <w:r>
-        <w:rPr>
-          <w:bdr w:val="nil"/>
-        </w:rPr>
-        <w:t>The</w:t>
-      </w:r>
-      <w:proofErr w:type="spellEnd"/>
-      <w:r>
-        <w:rPr>
-          <w:bdr w:val="nil"/>
-        </w:rPr>
-        <w:t xml:space="preserve"> </w:t>
-      </w:r>
-      <w:proofErr w:type="spellStart"/>
-      <w:r>
-        <w:rPr>
-          <w:bdr w:val="nil"/>
-        </w:rPr>
-        <w:t>world's</w:t>
-      </w:r>
-      <w:proofErr w:type="spellEnd"/>
-      <w:r>
-        <w:rPr>
-          <w:bdr w:val="nil"/>
-        </w:rPr>
-        <w:t xml:space="preserve"> </w:t>
-      </w:r>
-      <w:proofErr w:type="spellStart"/>
-      <w:r>
-        <w:rPr>
-          <w:bdr w:val="nil"/>
-        </w:rPr>
-        <w:t>most</w:t>
-      </w:r>
-      <w:proofErr w:type="spellEnd"/>
-      <w:r>
-        <w:rPr>
-          <w:bdr w:val="nil"/>
-        </w:rPr>
-        <w:t xml:space="preserve"> </w:t>
-      </w:r>
-      <w:proofErr w:type="spellStart"/>
-      <w:r>
-        <w:rPr>
-          <w:bdr w:val="nil"/>
-        </w:rPr>
-        <w:t>advanced</w:t>
-      </w:r>
-      <w:proofErr w:type="spellEnd"/>
-      <w:r>
-        <w:rPr>
-          <w:bdr w:val="nil"/>
-        </w:rPr>
-        <w:t xml:space="preserve"> </w:t>
-      </w:r>
-      <w:proofErr w:type="spellStart"/>
-      <w:r>
-        <w:rPr>
-          <w:bdr w:val="nil"/>
-        </w:rPr>
-        <w:t>open</w:t>
-      </w:r>
-      <w:proofErr w:type="spellEnd"/>
-      <w:r>
-        <w:rPr>
-          <w:bdr w:val="nil"/>
-        </w:rPr>
-        <w:t xml:space="preserve"> </w:t>
-      </w:r>
-      <w:proofErr w:type="spellStart"/>
-      <w:r>
-        <w:rPr>
-          <w:bdr w:val="nil"/>
-        </w:rPr>
-        <w:t>source</w:t>
-      </w:r>
-      <w:proofErr w:type="spellEnd"/>
-      <w:r>
-        <w:rPr>
-          <w:bdr w:val="nil"/>
-        </w:rPr>
-        <w:t xml:space="preserve"> </w:t>
-      </w:r>
-      <w:proofErr w:type="spellStart"/>
-      <w:r>
-        <w:rPr>
-          <w:bdr w:val="nil"/>
-        </w:rPr>
-        <w:t>database</w:t>
-      </w:r>
-      <w:proofErr w:type="spellEnd"/>
-      <w:r>
-        <w:rPr>
-          <w:bdr w:val="nil"/>
-        </w:rPr>
-        <w:t xml:space="preserve">. URL: </w:t>
+      <w:r>
+        <w:rPr>
+          <w:bdr w:val="nil"/>
+        </w:rPr>
+        <w:t xml:space="preserve">PostgreSQL: The world's most advanced open source database. URL: </w:t>
       </w:r>
       <w:hyperlink r:id="rId10" w:tgtFrame="_blank" w:history="1">
         <w:r>
@@ -2153,20 +1599,12 @@
           <w:bdr w:val="nil"/>
         </w:rPr>
       </w:pPr>
-      <w:proofErr w:type="spellStart"/>
       <w:r>
         <w:rPr>
           <w:bdr w:val="nil"/>
         </w:rPr>
         <w:lastRenderedPageBreak/>
-        <w:t>TypeORM</w:t>
-      </w:r>
-      <w:proofErr w:type="spellEnd"/>
-      <w:r>
-        <w:rPr>
-          <w:bdr w:val="nil"/>
-        </w:rPr>
-        <w:t xml:space="preserve">. URL: </w:t>
+        <w:t xml:space="preserve">TypeORM. URL: </w:t>
       </w:r>
       <w:hyperlink r:id="rId11" w:tgtFrame="_blank" w:history="1">
         <w:r>
@@ -2221,26 +1659,93 @@
         <w:rPr>
           <w:bdr w:val="nil"/>
         </w:rPr>
-        <w:t>Веб-</w:t>
-      </w:r>
-      <w:proofErr w:type="spellStart"/>
-      <w:r>
-        <w:rPr>
-          <w:bdr w:val="nil"/>
-        </w:rPr>
-        <w:t>скрапінг</w:t>
-      </w:r>
-      <w:proofErr w:type="spellEnd"/>
-      <w:r>
-        <w:rPr>
-          <w:bdr w:val="nil"/>
+        <w:t xml:space="preserve">Веб-скрапінг </w:t>
+      </w:r>
+      <w:r>
+        <w:t>–</w:t>
+      </w:r>
+      <w:r>
+        <w:rPr>
+          <w:lang w:val="ru-RU"/>
         </w:rPr>
         <w:t xml:space="preserve"> </w:t>
       </w:r>
       <w:r>
+        <w:rPr>
+          <w:bdr w:val="nil"/>
+        </w:rPr>
+        <w:t>технологія автоматизованого збору даних з вебсторінок.</w:t>
+      </w:r>
+    </w:p>
+    <w:p>
+      <w:pPr>
+        <w:pStyle w:val="Bullet"/>
+        <w:rPr>
+          <w:bdr w:val="nil"/>
+        </w:rPr>
+      </w:pPr>
+      <w:r>
+        <w:rPr>
+          <w:bdr w:val="nil"/>
+        </w:rPr>
+        <w:t xml:space="preserve">SPA (Single Page Application) </w:t>
+      </w:r>
+      <w:r>
         <w:t>–</w:t>
       </w:r>
       <w:r>
+        <w:t xml:space="preserve"> </w:t>
+      </w:r>
+      <w:r>
+        <w:rPr>
+          <w:bdr w:val="nil"/>
+        </w:rPr>
+        <w:t>вебзастосунок, який завантажує єдиний HTML-документ і динамічно оновлює його контент за допомогою JavaScript.</w:t>
+      </w:r>
+    </w:p>
+    <w:p>
+      <w:pPr>
+        <w:pStyle w:val="Bullet"/>
+        <w:rPr>
+          <w:bdr w:val="nil"/>
+        </w:rPr>
+      </w:pPr>
+      <w:r>
+        <w:rPr>
+          <w:bdr w:val="nil"/>
+        </w:rPr>
+        <w:t xml:space="preserve">Smart Scraper </w:t>
+      </w:r>
+      <w:r>
+        <w:t>–</w:t>
+      </w:r>
+      <w:r>
+        <w:t xml:space="preserve"> </w:t>
+      </w:r>
+      <w:r>
+        <w:rPr>
+          <w:bdr w:val="nil"/>
+        </w:rPr>
+        <w:t>розроблений програмний модуль, що використовує headless-браузер для збору даних з SPA-ресурсів та обходу блокувань.</w:t>
+      </w:r>
+    </w:p>
+    <w:p>
+      <w:pPr>
+        <w:pStyle w:val="Bullet"/>
+        <w:rPr>
+          <w:bdr w:val="nil"/>
+        </w:rPr>
+      </w:pPr>
+      <w:r>
+        <w:rPr>
+          <w:bdr w:val="nil"/>
+        </w:rPr>
+        <w:t xml:space="preserve">Часовий ряд </w:t>
+      </w:r>
+      <w:r>
+        <w:t>–</w:t>
+      </w:r>
+      <w:r>
         <w:rPr>
           <w:lang w:val="ru-RU"/>
         </w:rPr>
@@ -2250,21 +1755,19 @@
         <w:rPr>
           <w:bdr w:val="nil"/>
         </w:rPr>
-        <w:t xml:space="preserve">технологія автоматизованого збору даних з </w:t>
-      </w:r>
-      <w:proofErr w:type="spellStart"/>
-      <w:r>
-        <w:rPr>
-          <w:bdr w:val="nil"/>
-        </w:rPr>
-        <w:t>вебсторінок</w:t>
-      </w:r>
-      <w:proofErr w:type="spellEnd"/>
-      <w:r>
-        <w:rPr>
-          <w:bdr w:val="nil"/>
-        </w:rPr>
-        <w:t>.</w:t>
+        <w:t xml:space="preserve">послідовність точок даних (у даному випадку </w:t>
+      </w:r>
+      <w:r>
+        <w:rPr>
+          <w:bdr w:val="nil"/>
+        </w:rPr>
+        <w:t xml:space="preserve">– </w:t>
+      </w:r>
+      <w:r>
+        <w:rPr>
+          <w:bdr w:val="nil"/>
+        </w:rPr>
+        <w:t>цін), проіндексованих у хронологічному порядку.</w:t>
       </w:r>
     </w:p>
     <w:p>
@@ -2278,97 +1781,19 @@
         <w:rPr>
           <w:bdr w:val="nil"/>
         </w:rPr>
-        <w:t>SPA (</w:t>
-      </w:r>
-      <w:proofErr w:type="spellStart"/>
-      <w:r>
-        <w:rPr>
-          <w:bdr w:val="nil"/>
-        </w:rPr>
-        <w:t>Single</w:t>
-      </w:r>
-      <w:proofErr w:type="spellEnd"/>
-      <w:r>
-        <w:rPr>
-          <w:bdr w:val="nil"/>
-        </w:rPr>
+        <w:t xml:space="preserve">WAF (Web Application Firewall) </w:t>
+      </w:r>
+      <w:r>
+        <w:t>–</w:t>
+      </w:r>
+      <w:r>
         <w:t xml:space="preserve"> </w:t>
       </w:r>
-      <w:proofErr w:type="spellStart"/>
-      <w:r>
-        <w:rPr>
-          <w:bdr w:val="nil"/>
-        </w:rPr>
-        <w:t>Page</w:t>
-      </w:r>
-      <w:proofErr w:type="spellEnd"/>
-      <w:r>
-        <w:rPr>
-          <w:bdr w:val="nil"/>
-        </w:rPr>
-        <w:t xml:space="preserve"> </w:t>
-      </w:r>
-      <w:proofErr w:type="spellStart"/>
-      <w:r>
-        <w:rPr>
-          <w:bdr w:val="nil"/>
-        </w:rPr>
-        <w:t>Application</w:t>
-      </w:r>
-      <w:proofErr w:type="spellEnd"/>
-      <w:r>
-        <w:rPr>
-          <w:bdr w:val="nil"/>
-        </w:rPr>
-        <w:t xml:space="preserve">) </w:t>
-      </w:r>
-      <w:r>
-        <w:t>–</w:t>
-      </w:r>
-      <w:r>
-        <w:t xml:space="preserve"> </w:t>
-      </w:r>
-      <w:proofErr w:type="spellStart"/>
-      <w:r>
-        <w:rPr>
-          <w:bdr w:val="nil"/>
-        </w:rPr>
-        <w:t>вебзастосунок</w:t>
-      </w:r>
-      <w:proofErr w:type="spellEnd"/>
-      <w:r>
-        <w:rPr>
-          <w:bdr w:val="nil"/>
-        </w:rPr>
-        <w:t xml:space="preserve">, який завантажує єдиний HTML-документ і </w:t>
-      </w:r>
-      <w:proofErr w:type="spellStart"/>
-      <w:r>
-        <w:rPr>
-          <w:bdr w:val="nil"/>
-        </w:rPr>
-        <w:t>динамічно</w:t>
-      </w:r>
-      <w:proofErr w:type="spellEnd"/>
-      <w:r>
-        <w:rPr>
-          <w:bdr w:val="nil"/>
-        </w:rPr>
-        <w:t xml:space="preserve"> оновлює його контент за допомогою </w:t>
-      </w:r>
-      <w:proofErr w:type="spellStart"/>
-      <w:r>
-        <w:rPr>
-          <w:bdr w:val="nil"/>
-        </w:rPr>
-        <w:t>JavaScript</w:t>
-      </w:r>
-      <w:proofErr w:type="spellEnd"/>
-      <w:r>
-        <w:rPr>
-          <w:bdr w:val="nil"/>
-        </w:rPr>
-        <w:t>.</w:t>
+      <w:r>
+        <w:rPr>
+          <w:bdr w:val="nil"/>
+        </w:rPr>
+        <w:t>система захисту вебдодатків, яку обходить Smart Scraper за допомогою ротації проксі.</w:t>
       </w:r>
     </w:p>
     <w:p>
@@ -2378,266 +1803,11 @@
           <w:bdr w:val="nil"/>
         </w:rPr>
       </w:pPr>
-      <w:proofErr w:type="spellStart"/>
-      <w:r>
-        <w:rPr>
-          <w:bdr w:val="nil"/>
-        </w:rPr>
-        <w:t>Smart</w:t>
-      </w:r>
-      <w:proofErr w:type="spellEnd"/>
-      <w:r>
-        <w:rPr>
-          <w:bdr w:val="nil"/>
-        </w:rPr>
-        <w:t xml:space="preserve"> </w:t>
-      </w:r>
-      <w:proofErr w:type="spellStart"/>
-      <w:r>
-        <w:rPr>
-          <w:bdr w:val="nil"/>
-        </w:rPr>
-        <w:t>Scraper</w:t>
-      </w:r>
-      <w:proofErr w:type="spellEnd"/>
-      <w:r>
-        <w:rPr>
-          <w:bdr w:val="nil"/>
-        </w:rPr>
-        <w:t xml:space="preserve"> </w:t>
-      </w:r>
-      <w:r>
-        <w:t>–</w:t>
-      </w:r>
-      <w:r>
-        <w:t xml:space="preserve"> </w:t>
-      </w:r>
-      <w:r>
-        <w:rPr>
-          <w:bdr w:val="nil"/>
-        </w:rPr>
-        <w:t xml:space="preserve">розроблений програмний модуль, що використовує </w:t>
-      </w:r>
-      <w:proofErr w:type="spellStart"/>
-      <w:r>
-        <w:rPr>
-          <w:bdr w:val="nil"/>
-        </w:rPr>
-        <w:t>headless</w:t>
-      </w:r>
-      <w:proofErr w:type="spellEnd"/>
-      <w:r>
-        <w:rPr>
-          <w:bdr w:val="nil"/>
-        </w:rPr>
-        <w:t xml:space="preserve">-браузер для збору даних з SPA-ресурсів та обходу </w:t>
-      </w:r>
-      <w:proofErr w:type="spellStart"/>
-      <w:r>
-        <w:rPr>
-          <w:bdr w:val="nil"/>
-        </w:rPr>
-        <w:t>блокувань</w:t>
-      </w:r>
-      <w:proofErr w:type="spellEnd"/>
-      <w:r>
-        <w:rPr>
-          <w:bdr w:val="nil"/>
-        </w:rPr>
-        <w:t>.</w:t>
-      </w:r>
-    </w:p>
-    <w:p>
-      <w:pPr>
-        <w:pStyle w:val="Bullet"/>
-        <w:rPr>
-          <w:bdr w:val="nil"/>
-        </w:rPr>
-      </w:pPr>
-      <w:r>
-        <w:rPr>
-          <w:bdr w:val="nil"/>
-        </w:rPr>
-        <w:t xml:space="preserve">Часовий ряд </w:t>
-      </w:r>
-      <w:r>
-        <w:t>–</w:t>
-      </w:r>
-      <w:r>
-        <w:rPr>
-          <w:lang w:val="ru-RU"/>
-        </w:rPr>
-        <w:t xml:space="preserve"> </w:t>
-      </w:r>
-      <w:r>
-        <w:rPr>
-          <w:bdr w:val="nil"/>
-        </w:rPr>
-        <w:t xml:space="preserve">послідовність точок даних (у даному випадку </w:t>
-      </w:r>
-      <w:r>
-        <w:rPr>
-          <w:bdr w:val="nil"/>
-        </w:rPr>
-        <w:t xml:space="preserve">– </w:t>
-      </w:r>
-      <w:r>
-        <w:rPr>
-          <w:bdr w:val="nil"/>
-        </w:rPr>
-        <w:t>цін), проіндексованих у хронологічному порядку.</w:t>
-      </w:r>
-    </w:p>
-    <w:p>
-      <w:pPr>
-        <w:pStyle w:val="Bullet"/>
-        <w:rPr>
-          <w:bdr w:val="nil"/>
-        </w:rPr>
-      </w:pPr>
-      <w:r>
-        <w:rPr>
-          <w:bdr w:val="nil"/>
-        </w:rPr>
-        <w:t>WAF (</w:t>
-      </w:r>
-      <w:proofErr w:type="spellStart"/>
-      <w:r>
-        <w:rPr>
-          <w:bdr w:val="nil"/>
-        </w:rPr>
-        <w:t>Web</w:t>
-      </w:r>
-      <w:proofErr w:type="spellEnd"/>
-      <w:r>
-        <w:rPr>
-          <w:bdr w:val="nil"/>
-        </w:rPr>
-        <w:t xml:space="preserve"> </w:t>
-      </w:r>
-      <w:proofErr w:type="spellStart"/>
-      <w:r>
-        <w:rPr>
-          <w:bdr w:val="nil"/>
-        </w:rPr>
-        <w:t>Application</w:t>
-      </w:r>
-      <w:proofErr w:type="spellEnd"/>
-      <w:r>
-        <w:rPr>
-          <w:bdr w:val="nil"/>
-        </w:rPr>
-        <w:t xml:space="preserve"> </w:t>
-      </w:r>
-      <w:proofErr w:type="spellStart"/>
-      <w:r>
-        <w:rPr>
-          <w:bdr w:val="nil"/>
-        </w:rPr>
-        <w:t>Firewall</w:t>
-      </w:r>
-      <w:proofErr w:type="spellEnd"/>
-      <w:r>
-        <w:rPr>
-          <w:bdr w:val="nil"/>
-        </w:rPr>
-        <w:t xml:space="preserve">) </w:t>
-      </w:r>
-      <w:r>
-        <w:t>–</w:t>
-      </w:r>
-      <w:r>
-        <w:t xml:space="preserve"> </w:t>
-      </w:r>
-      <w:r>
-        <w:rPr>
-          <w:bdr w:val="nil"/>
-        </w:rPr>
-        <w:t xml:space="preserve">система захисту </w:t>
-      </w:r>
-      <w:proofErr w:type="spellStart"/>
-      <w:r>
-        <w:rPr>
-          <w:bdr w:val="nil"/>
-        </w:rPr>
-        <w:t>вебдодатків</w:t>
-      </w:r>
-      <w:proofErr w:type="spellEnd"/>
-      <w:r>
-        <w:rPr>
-          <w:bdr w:val="nil"/>
-        </w:rPr>
-        <w:t xml:space="preserve">, яку обходить </w:t>
-      </w:r>
-      <w:proofErr w:type="spellStart"/>
-      <w:r>
-        <w:rPr>
-          <w:bdr w:val="nil"/>
-        </w:rPr>
-        <w:t>Smart</w:t>
-      </w:r>
-      <w:proofErr w:type="spellEnd"/>
-      <w:r>
-        <w:rPr>
-          <w:bdr w:val="nil"/>
-        </w:rPr>
-        <w:t xml:space="preserve"> </w:t>
-      </w:r>
-      <w:proofErr w:type="spellStart"/>
-      <w:r>
-        <w:rPr>
-          <w:bdr w:val="nil"/>
-        </w:rPr>
-        <w:t>Scraper</w:t>
-      </w:r>
-      <w:proofErr w:type="spellEnd"/>
-      <w:r>
-        <w:rPr>
-          <w:bdr w:val="nil"/>
-        </w:rPr>
-        <w:t xml:space="preserve"> за допомогою ротації проксі.</w:t>
-      </w:r>
-    </w:p>
-    <w:p>
-      <w:pPr>
-        <w:pStyle w:val="Bullet"/>
-        <w:rPr>
-          <w:bdr w:val="nil"/>
-        </w:rPr>
-      </w:pPr>
-      <w:r>
-        <w:rPr>
-          <w:bdr w:val="nil"/>
-        </w:rPr>
-        <w:t xml:space="preserve">JWT (JSON </w:t>
-      </w:r>
-      <w:proofErr w:type="spellStart"/>
-      <w:r>
-        <w:rPr>
-          <w:bdr w:val="nil"/>
-        </w:rPr>
-        <w:t>Web</w:t>
-      </w:r>
-      <w:proofErr w:type="spellEnd"/>
-      <w:r>
-        <w:rPr>
-          <w:bdr w:val="nil"/>
-        </w:rPr>
-        <w:t xml:space="preserve"> </w:t>
-      </w:r>
-      <w:proofErr w:type="spellStart"/>
-      <w:r>
-        <w:rPr>
-          <w:bdr w:val="nil"/>
-        </w:rPr>
-        <w:t>Token</w:t>
-      </w:r>
-      <w:proofErr w:type="spellEnd"/>
-      <w:r>
-        <w:rPr>
-          <w:bdr w:val="nil"/>
-        </w:rPr>
-        <w:t xml:space="preserve">) </w:t>
+      <w:r>
+        <w:rPr>
+          <w:bdr w:val="nil"/>
+        </w:rPr>
+        <w:t xml:space="preserve">JWT (JSON Web Token) </w:t>
       </w:r>
       <w:r>
         <w:t>–</w:t>
@@ -2728,31 +1898,7 @@
           <w:szCs w:val="28"/>
           <w:bdr w:val="nil"/>
         </w:rPr>
-        <w:t>Розроблюване ПЗ є платформою, що вирішує актуальну проблему непрозорого ціноутворення в E-</w:t>
-      </w:r>
-      <w:proofErr w:type="spellStart"/>
-      <w:r>
-        <w:rPr>
-          <w:rFonts w:eastAsia="Arial Unicode MS"/>
-          <w:color w:val="000000"/>
-          <w:kern w:val="2"/>
-          <w:sz w:val="28"/>
-          <w:szCs w:val="28"/>
-          <w:bdr w:val="nil"/>
-        </w:rPr>
-        <w:t>commerce</w:t>
-      </w:r>
-      <w:proofErr w:type="spellEnd"/>
-      <w:r>
-        <w:rPr>
-          <w:rFonts w:eastAsia="Arial Unicode MS"/>
-          <w:color w:val="000000"/>
-          <w:kern w:val="2"/>
-          <w:sz w:val="28"/>
-          <w:szCs w:val="28"/>
-          <w:bdr w:val="nil"/>
-        </w:rPr>
-        <w:t>. У майбутньому система має потенціал для розвитку:</w:t>
+        <w:t>Розроблюване ПЗ є платформою, що вирішує актуальну проблему непрозорого ціноутворення в E-commerce. У майбутньому система має потенціал для розвитку:</w:t>
       </w:r>
     </w:p>
     <w:p>
@@ -2780,35 +1926,7 @@
         <w:rPr>
           <w:bdr w:val="nil"/>
         </w:rPr>
-        <w:t>впровадження системи сповіщень (</w:t>
-      </w:r>
-      <w:proofErr w:type="spellStart"/>
-      <w:r>
-        <w:rPr>
-          <w:bdr w:val="nil"/>
-        </w:rPr>
-        <w:t>email</w:t>
-      </w:r>
-      <w:proofErr w:type="spellEnd"/>
-      <w:r>
-        <w:rPr>
-          <w:bdr w:val="nil"/>
-        </w:rPr>
-        <w:t>/</w:t>
-      </w:r>
-      <w:proofErr w:type="spellStart"/>
-      <w:r>
-        <w:rPr>
-          <w:bdr w:val="nil"/>
-        </w:rPr>
-        <w:t>Telegram</w:t>
-      </w:r>
-      <w:proofErr w:type="spellEnd"/>
-      <w:r>
-        <w:rPr>
-          <w:bdr w:val="nil"/>
-        </w:rPr>
-        <w:t>) про реальне зниження ціни на відстежуваний товар;</w:t>
+        <w:t>впровадження системи сповіщень (email/Telegram) про реальне зниження ціни на відстежуваний товар;</w:t>
       </w:r>
     </w:p>
     <w:p>
@@ -2822,35 +1940,7 @@
         <w:rPr>
           <w:bdr w:val="nil"/>
         </w:rPr>
-        <w:t xml:space="preserve">підключення нових модулів </w:t>
-      </w:r>
-      <w:proofErr w:type="spellStart"/>
-      <w:r>
-        <w:rPr>
-          <w:bdr w:val="nil"/>
-        </w:rPr>
-        <w:t>скрапінгу</w:t>
-      </w:r>
-      <w:proofErr w:type="spellEnd"/>
-      <w:r>
-        <w:rPr>
-          <w:bdr w:val="nil"/>
-        </w:rPr>
-        <w:t xml:space="preserve"> для розширення списку підтримуваних </w:t>
-      </w:r>
-      <w:proofErr w:type="spellStart"/>
-      <w:r>
-        <w:rPr>
-          <w:bdr w:val="nil"/>
-        </w:rPr>
-        <w:t>маркетплейсів</w:t>
-      </w:r>
-      <w:proofErr w:type="spellEnd"/>
-      <w:r>
-        <w:rPr>
-          <w:bdr w:val="nil"/>
-        </w:rPr>
-        <w:t>.</w:t>
+        <w:t>підключення нових модулів скрапінгу для розширення списку підтримуваних маркетплейсів.</w:t>
       </w:r>
     </w:p>
     <w:p>
@@ -2922,35 +2012,7 @@
         <w:rPr>
           <w:bdr w:val="nil"/>
         </w:rPr>
-        <w:t>реєстрація та авторизація (через JWT у HTTP-</w:t>
-      </w:r>
-      <w:proofErr w:type="spellStart"/>
-      <w:r>
-        <w:rPr>
-          <w:bdr w:val="nil"/>
-        </w:rPr>
-        <w:t>only</w:t>
-      </w:r>
-      <w:proofErr w:type="spellEnd"/>
-      <w:r>
-        <w:rPr>
-          <w:bdr w:val="nil"/>
-        </w:rPr>
-        <w:t xml:space="preserve"> </w:t>
-      </w:r>
-      <w:proofErr w:type="spellStart"/>
-      <w:r>
-        <w:rPr>
-          <w:bdr w:val="nil"/>
-        </w:rPr>
-        <w:t>cookies</w:t>
-      </w:r>
-      <w:proofErr w:type="spellEnd"/>
-      <w:r>
-        <w:rPr>
-          <w:bdr w:val="nil"/>
-        </w:rPr>
-        <w:t>);</w:t>
+        <w:t>реєстрація та авторизація (через JWT у HTTP-only cookies);</w:t>
       </w:r>
     </w:p>
     <w:p>
@@ -2965,21 +2027,7 @@
           <w:bdr w:val="nil"/>
         </w:rPr>
         <w:lastRenderedPageBreak/>
-        <w:t xml:space="preserve">автоматичний фоновий запуск модулів </w:t>
-      </w:r>
-      <w:proofErr w:type="spellStart"/>
-      <w:r>
-        <w:rPr>
-          <w:bdr w:val="nil"/>
-        </w:rPr>
-        <w:t>Puppeteer</w:t>
-      </w:r>
-      <w:proofErr w:type="spellEnd"/>
-      <w:r>
-        <w:rPr>
-          <w:bdr w:val="nil"/>
-        </w:rPr>
-        <w:t xml:space="preserve"> для збору актуальних цін за URL-адресами;</w:t>
+        <w:t>автоматичний фоновий запуск модулів Puppeteer для збору актуальних цін за URL-адресами;</w:t>
       </w:r>
     </w:p>
     <w:p>
@@ -3137,21 +2185,7 @@
         <w:rPr>
           <w:bdr w:val="nil"/>
         </w:rPr>
-        <w:t xml:space="preserve">ринкові аналітики, які досліджують стратегії ціноутворення </w:t>
-      </w:r>
-      <w:proofErr w:type="spellStart"/>
-      <w:r>
-        <w:rPr>
-          <w:bdr w:val="nil"/>
-        </w:rPr>
-        <w:t>ритейлерів</w:t>
-      </w:r>
-      <w:proofErr w:type="spellEnd"/>
-      <w:r>
-        <w:rPr>
-          <w:bdr w:val="nil"/>
-        </w:rPr>
-        <w:t xml:space="preserve"> та будують звіти (рівень технічної підготовки: середній/високий);</w:t>
+        <w:t>ринкові аналітики, які досліджують стратегії ціноутворення ритейлерів та будують звіти (рівень технічної підготовки: середній/високий);</w:t>
       </w:r>
     </w:p>
     <w:p>
@@ -3165,21 +2199,7 @@
         <w:rPr>
           <w:bdr w:val="nil"/>
         </w:rPr>
-        <w:t xml:space="preserve">адміністратори системи, що здійснюють моніторинг успішності виконання скриптів </w:t>
-      </w:r>
-      <w:proofErr w:type="spellStart"/>
-      <w:r>
-        <w:rPr>
-          <w:bdr w:val="nil"/>
-        </w:rPr>
-        <w:t>скрапінгу</w:t>
-      </w:r>
-      <w:proofErr w:type="spellEnd"/>
-      <w:r>
-        <w:rPr>
-          <w:bdr w:val="nil"/>
-        </w:rPr>
-        <w:t xml:space="preserve"> та оновлюють конфігурації проксі.</w:t>
+        <w:t>адміністратори системи, що здійснюють моніторинг успішності виконання скриптів скрапінгу та оновлюють конфігурації проксі.</w:t>
       </w:r>
     </w:p>
     <w:p>
@@ -3250,21 +2270,7 @@
         <w:rPr>
           <w:bdr w:val="nil"/>
         </w:rPr>
-        <w:t xml:space="preserve">зміни у верстці цільових магазинів вимагають оперативного оновлення селекторів у коді </w:t>
-      </w:r>
-      <w:proofErr w:type="spellStart"/>
-      <w:r>
-        <w:rPr>
-          <w:bdr w:val="nil"/>
-        </w:rPr>
-        <w:t>скрапера</w:t>
-      </w:r>
-      <w:proofErr w:type="spellEnd"/>
-      <w:r>
-        <w:rPr>
-          <w:bdr w:val="nil"/>
-        </w:rPr>
-        <w:t>;</w:t>
+        <w:t>зміни у верстці цільових магазинів вимагають оперативного оновлення селекторів у коді скрапера;</w:t>
       </w:r>
     </w:p>
     <w:p>
@@ -3278,49 +2284,7 @@
         <w:rPr>
           <w:bdr w:val="nil"/>
         </w:rPr>
-        <w:t xml:space="preserve">використання </w:t>
-      </w:r>
-      <w:proofErr w:type="spellStart"/>
-      <w:r>
-        <w:rPr>
-          <w:bdr w:val="nil"/>
-        </w:rPr>
-        <w:t>headless</w:t>
-      </w:r>
-      <w:proofErr w:type="spellEnd"/>
-      <w:r>
-        <w:rPr>
-          <w:bdr w:val="nil"/>
-        </w:rPr>
-        <w:t>-браузерів (</w:t>
-      </w:r>
-      <w:proofErr w:type="spellStart"/>
-      <w:r>
-        <w:rPr>
-          <w:bdr w:val="nil"/>
-        </w:rPr>
-        <w:t>Puppeteer</w:t>
-      </w:r>
-      <w:proofErr w:type="spellEnd"/>
-      <w:r>
-        <w:rPr>
-          <w:bdr w:val="nil"/>
-        </w:rPr>
-        <w:t xml:space="preserve">) є </w:t>
-      </w:r>
-      <w:proofErr w:type="spellStart"/>
-      <w:r>
-        <w:rPr>
-          <w:bdr w:val="nil"/>
-        </w:rPr>
-        <w:t>ресурсоємним</w:t>
-      </w:r>
-      <w:proofErr w:type="spellEnd"/>
-      <w:r>
-        <w:rPr>
-          <w:bdr w:val="nil"/>
-        </w:rPr>
-        <w:t xml:space="preserve"> процесом і вимагає достатнього обсягу оперативної пам'яті на сервері;</w:t>
+        <w:t>використання headless-браузерів (Puppeteer) є ресурсоємним процесом і вимагає достатнього обсягу оперативної пам'яті на сервері;</w:t>
       </w:r>
     </w:p>
     <w:p>
@@ -3334,21 +2298,7 @@
         <w:rPr>
           <w:bdr w:val="nil"/>
         </w:rPr>
-        <w:t>інтенсивність збору даних обмежена анти-бот системами магазинів, що вимагає використання затримок (</w:t>
-      </w:r>
-      <w:proofErr w:type="spellStart"/>
-      <w:r>
-        <w:rPr>
-          <w:bdr w:val="nil"/>
-        </w:rPr>
-        <w:t>throttling</w:t>
-      </w:r>
-      <w:proofErr w:type="spellEnd"/>
-      <w:r>
-        <w:rPr>
-          <w:bdr w:val="nil"/>
-        </w:rPr>
-        <w:t>) та ротації проксі.</w:t>
+        <w:t>інтенсивність збору даних обмежена анти-бот системами магазинів, що вимагає використання затримок (throttling) та ротації проксі.</w:t>
       </w:r>
     </w:p>
     <w:p>
@@ -3417,31 +2367,7 @@
           <w:bdr w:val="nil"/>
         </w:rPr>
         <w:lastRenderedPageBreak/>
-        <w:t xml:space="preserve">коректної роботи реляційної бази даних </w:t>
-      </w:r>
-      <w:proofErr w:type="spellStart"/>
-      <w:r>
-        <w:rPr>
-          <w:rFonts w:eastAsia="Arial Unicode MS"/>
-          <w:color w:val="000000"/>
-          <w:kern w:val="2"/>
-          <w:sz w:val="28"/>
-          <w:szCs w:val="28"/>
-          <w:bdr w:val="nil"/>
-        </w:rPr>
-        <w:t>PostgreSQL</w:t>
-      </w:r>
-      <w:proofErr w:type="spellEnd"/>
-      <w:r>
-        <w:rPr>
-          <w:rFonts w:eastAsia="Arial Unicode MS"/>
-          <w:color w:val="000000"/>
-          <w:kern w:val="2"/>
-          <w:sz w:val="28"/>
-          <w:szCs w:val="28"/>
-          <w:bdr w:val="nil"/>
-        </w:rPr>
-        <w:t xml:space="preserve"> для збереження об'ємних часових рядів.</w:t>
+        <w:t>коректної роботи реляційної бази даних PostgreSQL для збереження об'ємних часових рядів.</w:t>
       </w:r>
     </w:p>
     <w:p>
@@ -3476,211 +2402,87 @@
     </w:p>
     <w:p>
       <w:pPr>
-        <w:pStyle w:val="NormalWeb"/>
-        <w:spacing w:before="0" w:beforeAutospacing="0" w:after="0" w:afterAutospacing="0" w:line="360" w:lineRule="auto"/>
-        <w:ind w:firstLine="720"/>
-        <w:jc w:val="both"/>
-        <w:rPr>
-          <w:rFonts w:eastAsia="Arial Unicode MS"/>
-          <w:color w:val="000000"/>
-          <w:kern w:val="2"/>
-          <w:sz w:val="28"/>
-          <w:szCs w:val="28"/>
-          <w:bdr w:val="nil"/>
-        </w:rPr>
-      </w:pPr>
-      <w:r>
-        <w:rPr>
-          <w:rFonts w:eastAsia="Arial Unicode MS"/>
-          <w:color w:val="000000"/>
-          <w:kern w:val="2"/>
-          <w:sz w:val="28"/>
-          <w:szCs w:val="28"/>
-          <w:bdr w:val="nil"/>
-        </w:rPr>
-        <w:t>3.1 Вимоги до зовнішніх інтерфейсів</w:t>
-      </w:r>
-    </w:p>
-    <w:p>
-      <w:pPr>
-        <w:pStyle w:val="NormalWeb"/>
-        <w:spacing w:before="0" w:beforeAutospacing="0" w:after="0" w:afterAutospacing="0" w:line="360" w:lineRule="auto"/>
-        <w:ind w:firstLine="720"/>
-        <w:jc w:val="both"/>
-        <w:rPr>
-          <w:rFonts w:eastAsia="Arial Unicode MS"/>
-          <w:color w:val="000000"/>
-          <w:kern w:val="2"/>
-          <w:sz w:val="28"/>
-          <w:szCs w:val="28"/>
-          <w:bdr w:val="nil"/>
-        </w:rPr>
-      </w:pPr>
-      <w:r>
-        <w:rPr>
-          <w:rFonts w:eastAsia="Arial Unicode MS"/>
-          <w:color w:val="000000"/>
-          <w:kern w:val="2"/>
-          <w:sz w:val="28"/>
-          <w:szCs w:val="28"/>
-          <w:bdr w:val="nil"/>
-        </w:rPr>
-        <w:t>3.1.1 Інтерфейс користувача</w:t>
-      </w:r>
-    </w:p>
-    <w:p>
-      <w:pPr>
-        <w:pStyle w:val="NormalWeb"/>
-        <w:spacing w:before="0" w:beforeAutospacing="0" w:after="0" w:afterAutospacing="0" w:line="360" w:lineRule="auto"/>
-        <w:ind w:left="720"/>
-        <w:jc w:val="both"/>
-        <w:rPr>
-          <w:rFonts w:eastAsia="Arial Unicode MS"/>
-          <w:color w:val="000000"/>
-          <w:kern w:val="2"/>
-          <w:sz w:val="28"/>
-          <w:szCs w:val="28"/>
-          <w:bdr w:val="nil"/>
-        </w:rPr>
-      </w:pPr>
-      <w:r>
-        <w:rPr>
-          <w:rFonts w:eastAsia="Arial Unicode MS"/>
-          <w:color w:val="000000"/>
-          <w:kern w:val="2"/>
-          <w:sz w:val="28"/>
-          <w:szCs w:val="28"/>
-          <w:bdr w:val="nil"/>
-        </w:rPr>
-        <w:t xml:space="preserve">Інтерфейс реалізується як клієнтський </w:t>
-      </w:r>
-      <w:proofErr w:type="spellStart"/>
-      <w:r>
-        <w:rPr>
-          <w:rFonts w:eastAsia="Arial Unicode MS"/>
-          <w:color w:val="000000"/>
-          <w:kern w:val="2"/>
-          <w:sz w:val="28"/>
-          <w:szCs w:val="28"/>
-          <w:bdr w:val="nil"/>
-        </w:rPr>
-        <w:t>вебзастосунок</w:t>
-      </w:r>
-      <w:proofErr w:type="spellEnd"/>
-      <w:r>
-        <w:rPr>
-          <w:rFonts w:eastAsia="Arial Unicode MS"/>
-          <w:color w:val="000000"/>
-          <w:kern w:val="2"/>
-          <w:sz w:val="28"/>
-          <w:szCs w:val="28"/>
-          <w:bdr w:val="nil"/>
-        </w:rPr>
-        <w:t xml:space="preserve"> (</w:t>
-      </w:r>
-      <w:proofErr w:type="spellStart"/>
-      <w:r>
-        <w:rPr>
-          <w:rFonts w:eastAsia="Arial Unicode MS"/>
-          <w:color w:val="000000"/>
-          <w:kern w:val="2"/>
-          <w:sz w:val="28"/>
-          <w:szCs w:val="28"/>
-          <w:bdr w:val="nil"/>
-        </w:rPr>
-        <w:t>React</w:t>
-      </w:r>
-      <w:proofErr w:type="spellEnd"/>
-      <w:r>
-        <w:rPr>
-          <w:rFonts w:eastAsia="Arial Unicode MS"/>
-          <w:color w:val="000000"/>
-          <w:kern w:val="2"/>
-          <w:sz w:val="28"/>
-          <w:szCs w:val="28"/>
-          <w:bdr w:val="nil"/>
-        </w:rPr>
-        <w:t xml:space="preserve"> + </w:t>
-      </w:r>
-      <w:proofErr w:type="spellStart"/>
-      <w:r>
-        <w:rPr>
-          <w:rFonts w:eastAsia="Arial Unicode MS"/>
-          <w:color w:val="000000"/>
-          <w:kern w:val="2"/>
-          <w:sz w:val="28"/>
-          <w:szCs w:val="28"/>
-          <w:bdr w:val="nil"/>
-        </w:rPr>
-        <w:t>Material</w:t>
-      </w:r>
-      <w:proofErr w:type="spellEnd"/>
-      <w:r>
-        <w:rPr>
-          <w:rFonts w:eastAsia="Arial Unicode MS"/>
-          <w:color w:val="000000"/>
-          <w:kern w:val="2"/>
-          <w:sz w:val="28"/>
-          <w:szCs w:val="28"/>
-          <w:bdr w:val="nil"/>
-        </w:rPr>
-        <w:t xml:space="preserve"> UI). Він містить:</w:t>
+        <w:pBdr>
+          <w:top w:val="none" w:sz="0" w:space="0" w:color="auto"/>
+          <w:left w:val="none" w:sz="0" w:space="0" w:color="auto"/>
+          <w:bottom w:val="none" w:sz="0" w:space="0" w:color="auto"/>
+          <w:right w:val="none" w:sz="0" w:space="0" w:color="auto"/>
+          <w:between w:val="none" w:sz="0" w:space="0" w:color="auto"/>
+          <w:bar w:val="none" w:sz="0" w:color="auto"/>
+        </w:pBdr>
+        <w:rPr>
+          <w:rFonts w:cs="Times New Roman"/>
+        </w:rPr>
+      </w:pPr>
+      <w:r>
+        <w:rPr>
+          <w:rFonts w:cs="Times New Roman"/>
+        </w:rPr>
+        <w:t>3.1 Користувацькі вимоги</w:t>
+      </w:r>
+    </w:p>
+    <w:p>
+      <w:pPr>
+        <w:pBdr>
+          <w:top w:val="none" w:sz="0" w:space="0" w:color="auto"/>
+          <w:left w:val="none" w:sz="0" w:space="0" w:color="auto"/>
+          <w:bottom w:val="none" w:sz="0" w:space="0" w:color="auto"/>
+          <w:right w:val="none" w:sz="0" w:space="0" w:color="auto"/>
+          <w:between w:val="none" w:sz="0" w:space="0" w:color="auto"/>
+          <w:bar w:val="none" w:sz="0" w:color="auto"/>
+        </w:pBdr>
+        <w:rPr>
+          <w:rFonts w:cs="Times New Roman"/>
+        </w:rPr>
+      </w:pPr>
+      <w:r>
+        <w:rPr>
+          <w:rFonts w:cs="Times New Roman"/>
+        </w:rPr>
+        <w:t xml:space="preserve">3.1.1 Інтерфейс користувача </w:t>
+      </w:r>
+    </w:p>
+    <w:p>
+      <w:pPr>
+        <w:pBdr>
+          <w:top w:val="none" w:sz="0" w:space="0" w:color="auto"/>
+          <w:left w:val="none" w:sz="0" w:space="0" w:color="auto"/>
+          <w:bottom w:val="none" w:sz="0" w:space="0" w:color="auto"/>
+          <w:right w:val="none" w:sz="0" w:space="0" w:color="auto"/>
+          <w:between w:val="none" w:sz="0" w:space="0" w:color="auto"/>
+          <w:bar w:val="none" w:sz="0" w:color="auto"/>
+        </w:pBdr>
+        <w:rPr>
+          <w:rFonts w:cs="Times New Roman"/>
+        </w:rPr>
+      </w:pPr>
+      <w:r>
+        <w:rPr>
+          <w:rFonts w:cs="Times New Roman"/>
+        </w:rPr>
+        <w:t xml:space="preserve">Інтерфейс реалізується як клієнтський вебзастосунок (React + Material UI). Він містить: </w:t>
       </w:r>
     </w:p>
     <w:p>
       <w:pPr>
         <w:pStyle w:val="Bullet"/>
-        <w:rPr>
-          <w:bdr w:val="nil"/>
-        </w:rPr>
-      </w:pPr>
-      <w:r>
-        <w:rPr>
-          <w:bdr w:val="nil"/>
-        </w:rPr>
-        <w:t>головну панель (</w:t>
-      </w:r>
-      <w:proofErr w:type="spellStart"/>
-      <w:r>
-        <w:rPr>
-          <w:bdr w:val="nil"/>
-        </w:rPr>
-        <w:t>Dashboard</w:t>
-      </w:r>
-      <w:proofErr w:type="spellEnd"/>
-      <w:r>
-        <w:rPr>
-          <w:bdr w:val="nil"/>
-        </w:rPr>
-        <w:t xml:space="preserve">) зі списком </w:t>
-      </w:r>
-      <w:proofErr w:type="spellStart"/>
-      <w:r>
-        <w:rPr>
-          <w:bdr w:val="nil"/>
-        </w:rPr>
-        <w:t>відстежуваних</w:t>
-      </w:r>
-      <w:proofErr w:type="spellEnd"/>
-      <w:r>
-        <w:rPr>
-          <w:bdr w:val="nil"/>
-        </w:rPr>
-        <w:t xml:space="preserve"> товарів;</w:t>
+      </w:pPr>
+      <w:r>
+        <w:rPr>
+          <w:bdr w:val="nil"/>
+        </w:rPr>
+        <w:t xml:space="preserve">головну панель (Dashboard) зі списком відстежуваних товарів; </w:t>
       </w:r>
     </w:p>
     <w:p>
       <w:pPr>
         <w:pStyle w:val="Bullet"/>
-        <w:rPr>
-          <w:bdr w:val="nil"/>
-        </w:rPr>
-      </w:pPr>
-      <w:r>
-        <w:rPr>
-          <w:bdr w:val="nil"/>
-        </w:rPr>
-        <w:t>сторінку детальної аналітики товару з інтерактивними графіками історії цін;</w:t>
+      </w:pPr>
+      <w:r>
+        <w:rPr>
+          <w:bdr w:val="nil"/>
+        </w:rPr>
+        <w:t xml:space="preserve">сторінку детальної аналітики товару з інтерактивними графіками історії цін; </w:t>
       </w:r>
     </w:p>
     <w:p>
@@ -3694,1510 +2496,552 @@
         <w:rPr>
           <w:bdr w:val="nil"/>
         </w:rPr>
-        <w:t xml:space="preserve">уніфікований адаптивний дизайн для коректного відображення на мобільних і </w:t>
-      </w:r>
-      <w:proofErr w:type="spellStart"/>
-      <w:r>
-        <w:rPr>
-          <w:bdr w:val="nil"/>
-        </w:rPr>
-        <w:t>десктопних</w:t>
-      </w:r>
-      <w:proofErr w:type="spellEnd"/>
-      <w:r>
-        <w:rPr>
-          <w:bdr w:val="nil"/>
-        </w:rPr>
-        <w:t xml:space="preserve"> пристроях.</w:t>
-      </w:r>
-    </w:p>
-    <w:p>
-      <w:pPr>
-        <w:pStyle w:val="NormalWeb"/>
-        <w:spacing w:before="0" w:beforeAutospacing="0" w:after="0" w:afterAutospacing="0" w:line="360" w:lineRule="auto"/>
-        <w:ind w:firstLine="709"/>
-        <w:jc w:val="both"/>
-        <w:rPr>
-          <w:rFonts w:eastAsia="Arial Unicode MS"/>
-          <w:color w:val="000000"/>
-          <w:kern w:val="2"/>
-          <w:sz w:val="28"/>
-          <w:szCs w:val="28"/>
-          <w:bdr w:val="nil"/>
-        </w:rPr>
-      </w:pPr>
-      <w:r>
-        <w:rPr>
-          <w:rFonts w:eastAsia="Arial Unicode MS"/>
-          <w:color w:val="000000"/>
-          <w:kern w:val="2"/>
-          <w:sz w:val="28"/>
-          <w:szCs w:val="28"/>
-          <w:bdr w:val="nil"/>
-        </w:rPr>
-        <w:t>3.1.2 Апаратний інтерфейс</w:t>
-      </w:r>
-    </w:p>
-    <w:p>
-      <w:pPr>
-        <w:pStyle w:val="NormalWeb"/>
-        <w:spacing w:before="0" w:beforeAutospacing="0" w:after="0" w:afterAutospacing="0" w:line="360" w:lineRule="auto"/>
-        <w:ind w:firstLine="709"/>
-        <w:jc w:val="both"/>
-        <w:rPr>
-          <w:rFonts w:eastAsia="Arial Unicode MS"/>
-          <w:color w:val="000000"/>
-          <w:kern w:val="2"/>
-          <w:sz w:val="28"/>
-          <w:szCs w:val="28"/>
-          <w:bdr w:val="nil"/>
-        </w:rPr>
-      </w:pPr>
-      <w:r>
-        <w:rPr>
-          <w:rFonts w:eastAsia="Arial Unicode MS"/>
-          <w:color w:val="000000"/>
-          <w:kern w:val="2"/>
-          <w:sz w:val="28"/>
-          <w:szCs w:val="28"/>
-          <w:bdr w:val="nil"/>
-        </w:rPr>
-        <w:t xml:space="preserve">Взаємодія зі специфічним апаратним забезпеченням відсутня. Клієнтська частина працює у будь-якому сучасному браузері. Серверна частина вимагає наявності щонайменше 2-4 ГБ оперативної пам'яті для паралельного запуску кількох екземплярів </w:t>
-      </w:r>
-      <w:proofErr w:type="spellStart"/>
-      <w:r>
-        <w:rPr>
-          <w:rFonts w:eastAsia="Arial Unicode MS"/>
-          <w:color w:val="000000"/>
-          <w:kern w:val="2"/>
-          <w:sz w:val="28"/>
-          <w:szCs w:val="28"/>
-          <w:bdr w:val="nil"/>
-        </w:rPr>
-        <w:t>Chromium</w:t>
-      </w:r>
-      <w:proofErr w:type="spellEnd"/>
-      <w:r>
-        <w:rPr>
-          <w:rFonts w:eastAsia="Arial Unicode MS"/>
-          <w:color w:val="000000"/>
-          <w:kern w:val="2"/>
-          <w:sz w:val="28"/>
-          <w:szCs w:val="28"/>
-          <w:bdr w:val="nil"/>
-        </w:rPr>
-        <w:t xml:space="preserve"> (через </w:t>
-      </w:r>
-      <w:proofErr w:type="spellStart"/>
-      <w:r>
-        <w:rPr>
-          <w:rFonts w:eastAsia="Arial Unicode MS"/>
-          <w:color w:val="000000"/>
-          <w:kern w:val="2"/>
-          <w:sz w:val="28"/>
-          <w:szCs w:val="28"/>
-          <w:bdr w:val="nil"/>
-        </w:rPr>
-        <w:t>Puppeteer</w:t>
-      </w:r>
-      <w:proofErr w:type="spellEnd"/>
-      <w:r>
-        <w:rPr>
-          <w:rFonts w:eastAsia="Arial Unicode MS"/>
-          <w:color w:val="000000"/>
-          <w:kern w:val="2"/>
-          <w:sz w:val="28"/>
-          <w:szCs w:val="28"/>
-          <w:bdr w:val="nil"/>
-        </w:rPr>
-        <w:t>).</w:t>
-      </w:r>
-    </w:p>
-    <w:p>
-      <w:pPr>
-        <w:pStyle w:val="NormalWeb"/>
-        <w:spacing w:before="0" w:beforeAutospacing="0" w:after="0" w:afterAutospacing="0" w:line="360" w:lineRule="auto"/>
-        <w:ind w:firstLine="709"/>
-        <w:jc w:val="both"/>
-        <w:rPr>
-          <w:rFonts w:eastAsia="Arial Unicode MS"/>
-          <w:color w:val="000000"/>
-          <w:kern w:val="2"/>
-          <w:sz w:val="28"/>
-          <w:szCs w:val="28"/>
-          <w:bdr w:val="nil"/>
-        </w:rPr>
-      </w:pPr>
-      <w:r>
-        <w:rPr>
-          <w:rFonts w:eastAsia="Arial Unicode MS"/>
-          <w:color w:val="000000"/>
-          <w:kern w:val="2"/>
-          <w:sz w:val="28"/>
-          <w:szCs w:val="28"/>
-          <w:bdr w:val="nil"/>
-        </w:rPr>
-        <w:t>3.1.3 Програмний інтерфейс</w:t>
-      </w:r>
-    </w:p>
-    <w:p>
-      <w:pPr>
-        <w:pStyle w:val="NormalWeb"/>
-        <w:spacing w:before="0" w:beforeAutospacing="0" w:after="0" w:afterAutospacing="0" w:line="360" w:lineRule="auto"/>
-        <w:ind w:firstLine="709"/>
-        <w:jc w:val="both"/>
-        <w:rPr>
-          <w:rFonts w:eastAsia="Arial Unicode MS"/>
-          <w:color w:val="000000"/>
-          <w:kern w:val="2"/>
-          <w:sz w:val="28"/>
-          <w:szCs w:val="28"/>
-          <w:bdr w:val="nil"/>
-        </w:rPr>
-      </w:pPr>
-      <w:r>
-        <w:rPr>
-          <w:rFonts w:eastAsia="Arial Unicode MS"/>
-          <w:color w:val="000000"/>
-          <w:kern w:val="2"/>
-          <w:sz w:val="28"/>
-          <w:szCs w:val="28"/>
-          <w:bdr w:val="nil"/>
-        </w:rPr>
-        <w:t>Взаємодія між клієнтською (</w:t>
-      </w:r>
-      <w:proofErr w:type="spellStart"/>
-      <w:r>
-        <w:rPr>
-          <w:rFonts w:eastAsia="Arial Unicode MS"/>
-          <w:color w:val="000000"/>
-          <w:kern w:val="2"/>
-          <w:sz w:val="28"/>
-          <w:szCs w:val="28"/>
-          <w:bdr w:val="nil"/>
-        </w:rPr>
-        <w:t>React</w:t>
-      </w:r>
-      <w:proofErr w:type="spellEnd"/>
-      <w:r>
-        <w:rPr>
-          <w:rFonts w:eastAsia="Arial Unicode MS"/>
-          <w:color w:val="000000"/>
-          <w:kern w:val="2"/>
-          <w:sz w:val="28"/>
-          <w:szCs w:val="28"/>
-          <w:bdr w:val="nil"/>
-        </w:rPr>
-        <w:t xml:space="preserve">) та серверною (Node.js) частинами відбувається через REST API. Формат обміну даними </w:t>
-      </w:r>
-      <w:r>
-        <w:rPr>
-          <w:rFonts w:eastAsia="Arial Unicode MS"/>
-          <w:color w:val="000000"/>
-          <w:kern w:val="2"/>
-          <w:sz w:val="28"/>
-          <w:szCs w:val="28"/>
-          <w:bdr w:val="nil"/>
-        </w:rPr>
-        <w:t xml:space="preserve">– </w:t>
-      </w:r>
-      <w:r>
-        <w:rPr>
-          <w:rFonts w:eastAsia="Arial Unicode MS"/>
-          <w:color w:val="000000"/>
-          <w:kern w:val="2"/>
-          <w:sz w:val="28"/>
-          <w:szCs w:val="28"/>
-          <w:bdr w:val="nil"/>
-        </w:rPr>
-        <w:t xml:space="preserve">JSON. Взаємодія з базою даних здійснюється через ORM-бібліотеку </w:t>
-      </w:r>
-      <w:proofErr w:type="spellStart"/>
-      <w:r>
-        <w:rPr>
-          <w:rFonts w:eastAsia="Arial Unicode MS"/>
-          <w:color w:val="000000"/>
-          <w:kern w:val="2"/>
-          <w:sz w:val="28"/>
-          <w:szCs w:val="28"/>
-          <w:bdr w:val="nil"/>
-        </w:rPr>
-        <w:t>TypeORM</w:t>
-      </w:r>
-      <w:proofErr w:type="spellEnd"/>
-      <w:r>
-        <w:rPr>
-          <w:rFonts w:eastAsia="Arial Unicode MS"/>
-          <w:color w:val="000000"/>
-          <w:kern w:val="2"/>
-          <w:sz w:val="28"/>
-          <w:szCs w:val="28"/>
-          <w:bdr w:val="nil"/>
-        </w:rPr>
-        <w:t>.</w:t>
-      </w:r>
-    </w:p>
-    <w:p>
-      <w:pPr>
-        <w:pStyle w:val="NormalWeb"/>
-        <w:spacing w:before="0" w:beforeAutospacing="0" w:after="0" w:afterAutospacing="0" w:line="360" w:lineRule="auto"/>
-        <w:ind w:firstLine="709"/>
-        <w:jc w:val="both"/>
-        <w:rPr>
-          <w:rFonts w:eastAsia="Arial Unicode MS"/>
-          <w:color w:val="000000"/>
-          <w:kern w:val="2"/>
-          <w:sz w:val="28"/>
-          <w:szCs w:val="28"/>
-          <w:bdr w:val="nil"/>
-        </w:rPr>
-      </w:pPr>
-      <w:r>
-        <w:rPr>
-          <w:rFonts w:eastAsia="Arial Unicode MS"/>
-          <w:color w:val="000000"/>
-          <w:kern w:val="2"/>
-          <w:sz w:val="28"/>
-          <w:szCs w:val="28"/>
-          <w:bdr w:val="nil"/>
-        </w:rPr>
-        <w:t>3.1.4 Комунікаційний протокол</w:t>
-      </w:r>
-    </w:p>
-    <w:p>
-      <w:pPr>
-        <w:pStyle w:val="Bullet"/>
-        <w:rPr>
-          <w:bdr w:val="nil"/>
-        </w:rPr>
-      </w:pPr>
-      <w:r>
-        <w:rPr>
-          <w:bdr w:val="nil"/>
-        </w:rPr>
-        <w:t xml:space="preserve">HTTPS (HTTP/1.1) </w:t>
-      </w:r>
-      <w:r>
-        <w:rPr>
-          <w:bdr w:val="nil"/>
-        </w:rPr>
-        <w:t xml:space="preserve">– </w:t>
-      </w:r>
-      <w:r>
-        <w:rPr>
-          <w:bdr w:val="nil"/>
-        </w:rPr>
-        <w:t>для обміну даними між клієнтом та REST API;</w:t>
-      </w:r>
-    </w:p>
-    <w:p>
-      <w:pPr>
-        <w:pStyle w:val="Bullet"/>
-        <w:rPr>
-          <w:bdr w:val="nil"/>
-        </w:rPr>
-      </w:pPr>
-      <w:r>
-        <w:rPr>
-          <w:bdr w:val="nil"/>
-        </w:rPr>
-        <w:t xml:space="preserve">TCP/IP </w:t>
-      </w:r>
-      <w:r>
-        <w:rPr>
-          <w:bdr w:val="nil"/>
-        </w:rPr>
-        <w:t xml:space="preserve">– </w:t>
-      </w:r>
-      <w:r>
-        <w:rPr>
-          <w:bdr w:val="nil"/>
-        </w:rPr>
-        <w:t>базовий транспортний рівень.</w:t>
-      </w:r>
-    </w:p>
-    <w:p>
-      <w:pPr>
-        <w:pStyle w:val="NormalWeb"/>
-        <w:spacing w:before="0" w:beforeAutospacing="0" w:after="0" w:afterAutospacing="0" w:line="360" w:lineRule="auto"/>
-        <w:ind w:firstLine="709"/>
-        <w:jc w:val="both"/>
-        <w:rPr>
-          <w:rFonts w:eastAsia="Arial Unicode MS"/>
-          <w:color w:val="000000"/>
-          <w:kern w:val="2"/>
-          <w:sz w:val="28"/>
-          <w:szCs w:val="28"/>
-          <w:bdr w:val="nil"/>
-        </w:rPr>
-      </w:pPr>
-      <w:r>
-        <w:rPr>
-          <w:rFonts w:eastAsia="Arial Unicode MS"/>
-          <w:color w:val="000000"/>
-          <w:kern w:val="2"/>
-          <w:sz w:val="28"/>
-          <w:szCs w:val="28"/>
-          <w:bdr w:val="nil"/>
-        </w:rPr>
-        <w:t>3.1.5 Обмеження пам’яті</w:t>
-      </w:r>
-    </w:p>
-    <w:p>
-      <w:pPr>
-        <w:pStyle w:val="NormalWeb"/>
-        <w:spacing w:before="0" w:beforeAutospacing="0" w:after="0" w:afterAutospacing="0" w:line="360" w:lineRule="auto"/>
-        <w:ind w:firstLine="709"/>
-        <w:jc w:val="both"/>
-        <w:rPr>
-          <w:rFonts w:eastAsia="Arial Unicode MS"/>
-          <w:color w:val="000000"/>
-          <w:kern w:val="2"/>
-          <w:sz w:val="28"/>
-          <w:szCs w:val="28"/>
-          <w:bdr w:val="nil"/>
-        </w:rPr>
-      </w:pPr>
-      <w:r>
-        <w:rPr>
-          <w:rFonts w:eastAsia="Arial Unicode MS"/>
-          <w:color w:val="000000"/>
-          <w:kern w:val="2"/>
-          <w:sz w:val="28"/>
-          <w:szCs w:val="28"/>
-          <w:bdr w:val="nil"/>
-        </w:rPr>
-        <w:t xml:space="preserve">Монолітний </w:t>
-      </w:r>
-      <w:proofErr w:type="spellStart"/>
-      <w:r>
-        <w:rPr>
-          <w:rFonts w:eastAsia="Arial Unicode MS"/>
-          <w:color w:val="000000"/>
-          <w:kern w:val="2"/>
-          <w:sz w:val="28"/>
-          <w:szCs w:val="28"/>
-          <w:bdr w:val="nil"/>
-        </w:rPr>
-        <w:t>бекенд</w:t>
-      </w:r>
-      <w:proofErr w:type="spellEnd"/>
-      <w:r>
-        <w:rPr>
-          <w:rFonts w:eastAsia="Arial Unicode MS"/>
-          <w:color w:val="000000"/>
-          <w:kern w:val="2"/>
-          <w:sz w:val="28"/>
-          <w:szCs w:val="28"/>
-          <w:bdr w:val="nil"/>
-        </w:rPr>
-        <w:t xml:space="preserve">-сервіс оптимізується для роботи в умовах обмеженої оперативної пам'яті. Жорстко контролюється життєвий цикл процесів </w:t>
-      </w:r>
-      <w:proofErr w:type="spellStart"/>
-      <w:r>
-        <w:rPr>
-          <w:rFonts w:eastAsia="Arial Unicode MS"/>
-          <w:color w:val="000000"/>
-          <w:kern w:val="2"/>
-          <w:sz w:val="28"/>
-          <w:szCs w:val="28"/>
-          <w:bdr w:val="nil"/>
-        </w:rPr>
-        <w:t>Puppeteer</w:t>
-      </w:r>
-      <w:proofErr w:type="spellEnd"/>
-      <w:r>
-        <w:rPr>
-          <w:rFonts w:eastAsia="Arial Unicode MS"/>
-          <w:color w:val="000000"/>
-          <w:kern w:val="2"/>
-          <w:sz w:val="28"/>
-          <w:szCs w:val="28"/>
-          <w:bdr w:val="nil"/>
-        </w:rPr>
-        <w:t>: після завершення циклу збору даних екземпляри браузера обов'язково закриваються для уникнення витоків пам'яті (</w:t>
-      </w:r>
-      <w:proofErr w:type="spellStart"/>
-      <w:r>
-        <w:rPr>
-          <w:rFonts w:eastAsia="Arial Unicode MS"/>
-          <w:color w:val="000000"/>
-          <w:kern w:val="2"/>
-          <w:sz w:val="28"/>
-          <w:szCs w:val="28"/>
-          <w:bdr w:val="nil"/>
-        </w:rPr>
-        <w:t>memory</w:t>
-      </w:r>
-      <w:proofErr w:type="spellEnd"/>
-      <w:r>
-        <w:rPr>
-          <w:rFonts w:eastAsia="Arial Unicode MS"/>
-          <w:color w:val="000000"/>
-          <w:kern w:val="2"/>
-          <w:sz w:val="28"/>
-          <w:szCs w:val="28"/>
-          <w:bdr w:val="nil"/>
-        </w:rPr>
-        <w:t xml:space="preserve"> </w:t>
-      </w:r>
-      <w:proofErr w:type="spellStart"/>
-      <w:r>
-        <w:rPr>
-          <w:rFonts w:eastAsia="Arial Unicode MS"/>
-          <w:color w:val="000000"/>
-          <w:kern w:val="2"/>
-          <w:sz w:val="28"/>
-          <w:szCs w:val="28"/>
-          <w:bdr w:val="nil"/>
-        </w:rPr>
-        <w:t>leaks</w:t>
-      </w:r>
-      <w:proofErr w:type="spellEnd"/>
-      <w:r>
-        <w:rPr>
-          <w:rFonts w:eastAsia="Arial Unicode MS"/>
-          <w:color w:val="000000"/>
-          <w:kern w:val="2"/>
-          <w:sz w:val="28"/>
-          <w:szCs w:val="28"/>
-          <w:bdr w:val="nil"/>
-        </w:rPr>
-        <w:t>).</w:t>
-      </w:r>
-    </w:p>
-    <w:p>
-      <w:pPr>
-        <w:pStyle w:val="NormalWeb"/>
-        <w:spacing w:before="0" w:beforeAutospacing="0" w:after="0" w:afterAutospacing="0" w:line="360" w:lineRule="auto"/>
-        <w:ind w:firstLine="709"/>
-        <w:jc w:val="both"/>
-        <w:rPr>
-          <w:rFonts w:eastAsia="Arial Unicode MS"/>
-          <w:color w:val="000000"/>
-          <w:kern w:val="2"/>
-          <w:sz w:val="28"/>
-          <w:szCs w:val="28"/>
-          <w:bdr w:val="nil"/>
-        </w:rPr>
-      </w:pPr>
-      <w:r>
-        <w:rPr>
-          <w:rFonts w:eastAsia="Arial Unicode MS"/>
-          <w:color w:val="000000"/>
-          <w:kern w:val="2"/>
-          <w:sz w:val="28"/>
-          <w:szCs w:val="28"/>
-          <w:bdr w:val="nil"/>
+        <w:t>уніфікований адаптивний дизайн для коректного відображення на мобільних і десктопних пристроях.</w:t>
+      </w:r>
+    </w:p>
+    <w:p>
+      <w:pPr>
+        <w:pBdr>
+          <w:top w:val="none" w:sz="0" w:space="0" w:color="auto"/>
+          <w:left w:val="none" w:sz="0" w:space="0" w:color="auto"/>
+          <w:bottom w:val="none" w:sz="0" w:space="0" w:color="auto"/>
+          <w:right w:val="none" w:sz="0" w:space="0" w:color="auto"/>
+          <w:between w:val="none" w:sz="0" w:space="0" w:color="auto"/>
+          <w:bar w:val="none" w:sz="0" w:color="auto"/>
+        </w:pBdr>
+        <w:rPr>
+          <w:rFonts w:cs="Times New Roman"/>
+        </w:rPr>
+      </w:pPr>
+      <w:r>
+        <w:rPr>
+          <w:rFonts w:cs="Times New Roman"/>
+        </w:rPr>
+        <w:t xml:space="preserve">3.1.2 Зручність використання </w:t>
+      </w:r>
+    </w:p>
+    <w:p>
+      <w:pPr>
+        <w:pBdr>
+          <w:top w:val="none" w:sz="0" w:space="0" w:color="auto"/>
+          <w:left w:val="none" w:sz="0" w:space="0" w:color="auto"/>
+          <w:bottom w:val="none" w:sz="0" w:space="0" w:color="auto"/>
+          <w:right w:val="none" w:sz="0" w:space="0" w:color="auto"/>
+          <w:between w:val="none" w:sz="0" w:space="0" w:color="auto"/>
+          <w:bar w:val="none" w:sz="0" w:color="auto"/>
+        </w:pBdr>
+        <w:rPr>
+          <w:rFonts w:cs="Times New Roman"/>
+        </w:rPr>
+      </w:pPr>
+      <w:r>
+        <w:rPr>
+          <w:rFonts w:cs="Times New Roman"/>
+        </w:rPr>
+        <w:t>Клієнтський інтерфейс, побудований на базі бібліотек React та Material UI, забезпечуватиме інтуїтивно зрозумілу навігацію та адаптивний дизайн, повністю сумісний із мобільними і десктопними пристроями. Користувачі отримуватимуть оперативний зворотний зв’язок під час пошуку товарів або налаштування трекерів, а кількість кроків для доступу до візуалізації часових рядів буде мінімізована.</w:t>
+      </w:r>
+    </w:p>
+    <w:p>
+      <w:pPr>
+        <w:pBdr>
+          <w:top w:val="none" w:sz="0" w:space="0" w:color="auto"/>
+          <w:left w:val="none" w:sz="0" w:space="0" w:color="auto"/>
+          <w:bottom w:val="none" w:sz="0" w:space="0" w:color="auto"/>
+          <w:right w:val="none" w:sz="0" w:space="0" w:color="auto"/>
+          <w:between w:val="none" w:sz="0" w:space="0" w:color="auto"/>
+          <w:bar w:val="none" w:sz="0" w:color="auto"/>
+        </w:pBdr>
+        <w:rPr>
+          <w:rFonts w:cs="Times New Roman"/>
+        </w:rPr>
+      </w:pPr>
+      <w:r>
+        <w:rPr>
+          <w:rFonts w:cs="Times New Roman"/>
+        </w:rPr>
+        <w:t>3.2 Системні вимоги</w:t>
+      </w:r>
+    </w:p>
+    <w:p>
+      <w:pPr>
+        <w:pBdr>
+          <w:top w:val="none" w:sz="0" w:space="0" w:color="auto"/>
+          <w:left w:val="none" w:sz="0" w:space="0" w:color="auto"/>
+          <w:bottom w:val="none" w:sz="0" w:space="0" w:color="auto"/>
+          <w:right w:val="none" w:sz="0" w:space="0" w:color="auto"/>
+          <w:between w:val="none" w:sz="0" w:space="0" w:color="auto"/>
+          <w:bar w:val="none" w:sz="0" w:color="auto"/>
+        </w:pBdr>
+        <w:rPr>
+          <w:rFonts w:cs="Times New Roman"/>
+        </w:rPr>
+      </w:pPr>
+      <w:r>
+        <w:rPr>
+          <w:rFonts w:cs="Times New Roman"/>
+        </w:rPr>
+        <w:t xml:space="preserve">3.2.1 Апаратний інтерфейс </w:t>
+      </w:r>
+    </w:p>
+    <w:p>
+      <w:pPr>
+        <w:pBdr>
+          <w:top w:val="none" w:sz="0" w:space="0" w:color="auto"/>
+          <w:left w:val="none" w:sz="0" w:space="0" w:color="auto"/>
+          <w:bottom w:val="none" w:sz="0" w:space="0" w:color="auto"/>
+          <w:right w:val="none" w:sz="0" w:space="0" w:color="auto"/>
+          <w:between w:val="none" w:sz="0" w:space="0" w:color="auto"/>
+          <w:bar w:val="none" w:sz="0" w:color="auto"/>
+        </w:pBdr>
+        <w:rPr>
+          <w:rFonts w:cs="Times New Roman"/>
+        </w:rPr>
+      </w:pPr>
+      <w:r>
+        <w:rPr>
+          <w:rFonts w:cs="Times New Roman"/>
+        </w:rPr>
+        <w:t>Взаємодія зі специфічним апаратним забезпеченням відсутня. Клієнтська частина працює у будь-якому сучасному браузері. Серверна частина вимагає наявності щонайменше 2-4 ГБ оперативної пам'яті для паралельного запуску кількох екземплярів Chromium (через Puppeteer).</w:t>
+      </w:r>
+    </w:p>
+    <w:p>
+      <w:pPr>
+        <w:pBdr>
+          <w:top w:val="none" w:sz="0" w:space="0" w:color="auto"/>
+          <w:left w:val="none" w:sz="0" w:space="0" w:color="auto"/>
+          <w:bottom w:val="none" w:sz="0" w:space="0" w:color="auto"/>
+          <w:right w:val="none" w:sz="0" w:space="0" w:color="auto"/>
+          <w:between w:val="none" w:sz="0" w:space="0" w:color="auto"/>
+          <w:bar w:val="none" w:sz="0" w:color="auto"/>
+        </w:pBdr>
+        <w:rPr>
+          <w:rFonts w:cs="Times New Roman"/>
+        </w:rPr>
+      </w:pPr>
+      <w:r>
+        <w:rPr>
+          <w:rFonts w:cs="Times New Roman"/>
+        </w:rPr>
+        <w:t xml:space="preserve">3.2.2 Обмеження пам’яті </w:t>
+      </w:r>
+    </w:p>
+    <w:p>
+      <w:pPr>
+        <w:pBdr>
+          <w:top w:val="none" w:sz="0" w:space="0" w:color="auto"/>
+          <w:left w:val="none" w:sz="0" w:space="0" w:color="auto"/>
+          <w:bottom w:val="none" w:sz="0" w:space="0" w:color="auto"/>
+          <w:right w:val="none" w:sz="0" w:space="0" w:color="auto"/>
+          <w:between w:val="none" w:sz="0" w:space="0" w:color="auto"/>
+          <w:bar w:val="none" w:sz="0" w:color="auto"/>
+        </w:pBdr>
+        <w:rPr>
+          <w:rFonts w:cs="Times New Roman"/>
+        </w:rPr>
+      </w:pPr>
+      <w:r>
+        <w:rPr>
+          <w:rFonts w:cs="Times New Roman"/>
+        </w:rPr>
+        <w:t xml:space="preserve">Монолітний бекенд-сервіс оптимізується для роботи в умовах обмеженої оперативної пам'яті. Жорстко контролюється життєвий цикл процесів Puppeteer: </w:t>
+      </w:r>
+      <w:r>
+        <w:rPr>
+          <w:rFonts w:cs="Times New Roman"/>
         </w:rPr>
         <w:lastRenderedPageBreak/>
-        <w:t>3.1.6 Операції</w:t>
-      </w:r>
-    </w:p>
-    <w:p>
-      <w:pPr>
-        <w:pStyle w:val="NormalWeb"/>
-        <w:spacing w:before="0" w:beforeAutospacing="0" w:after="0" w:afterAutospacing="0" w:line="360" w:lineRule="auto"/>
-        <w:ind w:firstLine="709"/>
-        <w:jc w:val="both"/>
-        <w:rPr>
-          <w:rFonts w:eastAsia="Arial Unicode MS"/>
-          <w:color w:val="000000"/>
-          <w:kern w:val="2"/>
-          <w:sz w:val="28"/>
-          <w:szCs w:val="28"/>
-          <w:bdr w:val="nil"/>
-        </w:rPr>
-      </w:pPr>
-      <w:r>
-        <w:rPr>
-          <w:rFonts w:eastAsia="Arial Unicode MS"/>
-          <w:color w:val="000000"/>
-          <w:kern w:val="2"/>
-          <w:sz w:val="28"/>
-          <w:szCs w:val="28"/>
-          <w:bdr w:val="nil"/>
-        </w:rPr>
-        <w:t xml:space="preserve">Базові операції включають: запуск фонової задачі </w:t>
-      </w:r>
-      <w:proofErr w:type="spellStart"/>
-      <w:r>
-        <w:rPr>
-          <w:rFonts w:eastAsia="Arial Unicode MS"/>
-          <w:color w:val="000000"/>
-          <w:kern w:val="2"/>
-          <w:sz w:val="28"/>
-          <w:szCs w:val="28"/>
-          <w:bdr w:val="nil"/>
-        </w:rPr>
-        <w:t>скрапінгу</w:t>
-      </w:r>
-      <w:proofErr w:type="spellEnd"/>
-      <w:r>
-        <w:rPr>
-          <w:rFonts w:eastAsia="Arial Unicode MS"/>
-          <w:color w:val="000000"/>
-          <w:kern w:val="2"/>
-          <w:sz w:val="28"/>
-          <w:szCs w:val="28"/>
-          <w:bdr w:val="nil"/>
-        </w:rPr>
-        <w:t xml:space="preserve"> (</w:t>
-      </w:r>
-      <w:proofErr w:type="spellStart"/>
-      <w:r>
-        <w:rPr>
-          <w:rFonts w:eastAsia="Arial Unicode MS"/>
-          <w:color w:val="000000"/>
-          <w:kern w:val="2"/>
-          <w:sz w:val="28"/>
-          <w:szCs w:val="28"/>
-          <w:bdr w:val="nil"/>
-        </w:rPr>
-        <w:t>cron</w:t>
-      </w:r>
-      <w:proofErr w:type="spellEnd"/>
-      <w:r>
-        <w:rPr>
-          <w:rFonts w:eastAsia="Arial Unicode MS"/>
-          <w:color w:val="000000"/>
-          <w:kern w:val="2"/>
-          <w:sz w:val="28"/>
-          <w:szCs w:val="28"/>
-          <w:bdr w:val="nil"/>
-        </w:rPr>
-        <w:t xml:space="preserve"> </w:t>
-      </w:r>
-      <w:proofErr w:type="spellStart"/>
-      <w:r>
-        <w:rPr>
-          <w:rFonts w:eastAsia="Arial Unicode MS"/>
-          <w:color w:val="000000"/>
-          <w:kern w:val="2"/>
-          <w:sz w:val="28"/>
-          <w:szCs w:val="28"/>
-          <w:bdr w:val="nil"/>
-        </w:rPr>
-        <w:t>jobs</w:t>
-      </w:r>
-      <w:proofErr w:type="spellEnd"/>
-      <w:r>
-        <w:rPr>
-          <w:rFonts w:eastAsia="Arial Unicode MS"/>
-          <w:color w:val="000000"/>
-          <w:kern w:val="2"/>
-          <w:sz w:val="28"/>
-          <w:szCs w:val="28"/>
-          <w:bdr w:val="nil"/>
-        </w:rPr>
-        <w:t>), нормалізацію отриманого HTML-коду, запис нових точок часового ряду в БД, обробку клієнтських запитів на отримання статистичних агрегацій.</w:t>
-      </w:r>
-    </w:p>
-    <w:p>
-      <w:pPr>
-        <w:pStyle w:val="NormalWeb"/>
-        <w:spacing w:before="0" w:beforeAutospacing="0" w:after="0" w:afterAutospacing="0" w:line="360" w:lineRule="auto"/>
-        <w:ind w:firstLine="709"/>
-        <w:jc w:val="both"/>
-        <w:rPr>
-          <w:rFonts w:eastAsia="Arial Unicode MS"/>
-          <w:color w:val="000000"/>
-          <w:kern w:val="2"/>
-          <w:sz w:val="28"/>
-          <w:szCs w:val="28"/>
-          <w:bdr w:val="nil"/>
-        </w:rPr>
-      </w:pPr>
-      <w:r>
-        <w:rPr>
-          <w:rFonts w:eastAsia="Arial Unicode MS"/>
-          <w:color w:val="000000"/>
-          <w:kern w:val="2"/>
-          <w:sz w:val="28"/>
-          <w:szCs w:val="28"/>
-          <w:bdr w:val="nil"/>
-        </w:rPr>
-        <w:t>3.2 Атрибути програмного продукту</w:t>
-      </w:r>
-    </w:p>
-    <w:p>
-      <w:pPr>
-        <w:pStyle w:val="NormalWeb"/>
-        <w:spacing w:before="0" w:beforeAutospacing="0" w:after="0" w:afterAutospacing="0" w:line="360" w:lineRule="auto"/>
-        <w:ind w:firstLine="709"/>
-        <w:jc w:val="both"/>
-        <w:rPr>
-          <w:rFonts w:eastAsia="Arial Unicode MS"/>
-          <w:color w:val="000000"/>
-          <w:kern w:val="2"/>
-          <w:sz w:val="28"/>
-          <w:szCs w:val="28"/>
-          <w:bdr w:val="nil"/>
-        </w:rPr>
-      </w:pPr>
-      <w:r>
-        <w:rPr>
-          <w:rFonts w:eastAsia="Arial Unicode MS"/>
-          <w:color w:val="000000"/>
-          <w:kern w:val="2"/>
-          <w:sz w:val="28"/>
-          <w:szCs w:val="28"/>
-          <w:bdr w:val="nil"/>
-        </w:rPr>
-        <w:t>3.2.1 Надійність</w:t>
-      </w:r>
-    </w:p>
-    <w:p>
-      <w:pPr>
-        <w:pStyle w:val="NormalWeb"/>
-        <w:spacing w:before="0" w:beforeAutospacing="0" w:after="0" w:afterAutospacing="0" w:line="360" w:lineRule="auto"/>
-        <w:ind w:firstLine="709"/>
-        <w:jc w:val="both"/>
-        <w:rPr>
-          <w:rFonts w:eastAsia="Arial Unicode MS"/>
-          <w:color w:val="000000"/>
-          <w:kern w:val="2"/>
-          <w:sz w:val="28"/>
-          <w:szCs w:val="28"/>
-          <w:bdr w:val="nil"/>
-        </w:rPr>
-      </w:pPr>
-      <w:r>
-        <w:rPr>
-          <w:rFonts w:eastAsia="Arial Unicode MS"/>
-          <w:color w:val="000000"/>
-          <w:kern w:val="2"/>
-          <w:sz w:val="28"/>
-          <w:szCs w:val="28"/>
-          <w:bdr w:val="nil"/>
-        </w:rPr>
-        <w:t xml:space="preserve">Стійкість до помилок </w:t>
-      </w:r>
-      <w:proofErr w:type="spellStart"/>
-      <w:r>
-        <w:rPr>
-          <w:rFonts w:eastAsia="Arial Unicode MS"/>
-          <w:color w:val="000000"/>
-          <w:kern w:val="2"/>
-          <w:sz w:val="28"/>
-          <w:szCs w:val="28"/>
-          <w:bdr w:val="nil"/>
-        </w:rPr>
-        <w:t>парсингу</w:t>
-      </w:r>
-      <w:proofErr w:type="spellEnd"/>
-      <w:r>
-        <w:rPr>
-          <w:rFonts w:eastAsia="Arial Unicode MS"/>
-          <w:color w:val="000000"/>
-          <w:kern w:val="2"/>
-          <w:sz w:val="28"/>
-          <w:szCs w:val="28"/>
-          <w:bdr w:val="nil"/>
-        </w:rPr>
-        <w:t xml:space="preserve">: у разі неможливості зчитати ціну (наприклад, товар відсутній або змінено верстку), система не перериває загальний процес, а </w:t>
-      </w:r>
-      <w:proofErr w:type="spellStart"/>
-      <w:r>
-        <w:rPr>
-          <w:rFonts w:eastAsia="Arial Unicode MS"/>
-          <w:color w:val="000000"/>
-          <w:kern w:val="2"/>
-          <w:sz w:val="28"/>
-          <w:szCs w:val="28"/>
-          <w:bdr w:val="nil"/>
-        </w:rPr>
-        <w:t>логує</w:t>
-      </w:r>
-      <w:proofErr w:type="spellEnd"/>
-      <w:r>
-        <w:rPr>
-          <w:rFonts w:eastAsia="Arial Unicode MS"/>
-          <w:color w:val="000000"/>
-          <w:kern w:val="2"/>
-          <w:sz w:val="28"/>
-          <w:szCs w:val="28"/>
-          <w:bdr w:val="nil"/>
-        </w:rPr>
-        <w:t xml:space="preserve"> помилку та переходить до наступного товару.</w:t>
-      </w:r>
-    </w:p>
-    <w:p>
-      <w:pPr>
-        <w:pStyle w:val="NormalWeb"/>
-        <w:spacing w:before="0" w:beforeAutospacing="0" w:after="0" w:afterAutospacing="0" w:line="360" w:lineRule="auto"/>
-        <w:ind w:firstLine="709"/>
-        <w:jc w:val="both"/>
-        <w:rPr>
-          <w:rFonts w:eastAsia="Arial Unicode MS"/>
-          <w:color w:val="000000"/>
-          <w:kern w:val="2"/>
-          <w:sz w:val="28"/>
-          <w:szCs w:val="28"/>
-          <w:bdr w:val="nil"/>
-        </w:rPr>
-      </w:pPr>
-      <w:r>
-        <w:rPr>
-          <w:rFonts w:eastAsia="Arial Unicode MS"/>
-          <w:color w:val="000000"/>
-          <w:kern w:val="2"/>
-          <w:sz w:val="28"/>
-          <w:szCs w:val="28"/>
-          <w:bdr w:val="nil"/>
-        </w:rPr>
-        <w:t>3.2.2 Продуктивність</w:t>
-      </w:r>
-    </w:p>
-    <w:p>
-      <w:pPr>
-        <w:pStyle w:val="NormalWeb"/>
-        <w:spacing w:before="0" w:beforeAutospacing="0" w:after="0" w:afterAutospacing="0" w:line="360" w:lineRule="auto"/>
-        <w:ind w:firstLine="709"/>
-        <w:jc w:val="both"/>
-        <w:rPr>
-          <w:rFonts w:eastAsia="Arial Unicode MS"/>
-          <w:color w:val="000000"/>
-          <w:kern w:val="2"/>
-          <w:sz w:val="28"/>
-          <w:szCs w:val="28"/>
-          <w:bdr w:val="nil"/>
-        </w:rPr>
-      </w:pPr>
-      <w:r>
-        <w:rPr>
-          <w:rFonts w:eastAsia="Arial Unicode MS"/>
-          <w:color w:val="000000"/>
-          <w:kern w:val="2"/>
-          <w:sz w:val="28"/>
-          <w:szCs w:val="28"/>
-          <w:bdr w:val="nil"/>
-        </w:rPr>
-        <w:t xml:space="preserve">Використання індексації ключових полів бази даних (наприклад, артикулів, ідентифікаторів товарів) та застосування </w:t>
-      </w:r>
-      <w:proofErr w:type="spellStart"/>
-      <w:r>
-        <w:rPr>
-          <w:rFonts w:eastAsia="Arial Unicode MS"/>
-          <w:color w:val="000000"/>
-          <w:kern w:val="2"/>
-          <w:sz w:val="28"/>
-          <w:szCs w:val="28"/>
-          <w:bdr w:val="nil"/>
-        </w:rPr>
-        <w:t>Connection</w:t>
-      </w:r>
-      <w:proofErr w:type="spellEnd"/>
-      <w:r>
-        <w:rPr>
-          <w:rFonts w:eastAsia="Arial Unicode MS"/>
-          <w:color w:val="000000"/>
-          <w:kern w:val="2"/>
-          <w:sz w:val="28"/>
-          <w:szCs w:val="28"/>
-          <w:bdr w:val="nil"/>
-        </w:rPr>
-        <w:t xml:space="preserve"> </w:t>
-      </w:r>
-      <w:proofErr w:type="spellStart"/>
-      <w:r>
-        <w:rPr>
-          <w:rFonts w:eastAsia="Arial Unicode MS"/>
-          <w:color w:val="000000"/>
-          <w:kern w:val="2"/>
-          <w:sz w:val="28"/>
-          <w:szCs w:val="28"/>
-          <w:bdr w:val="nil"/>
-        </w:rPr>
-        <w:t>Pooling</w:t>
-      </w:r>
-      <w:proofErr w:type="spellEnd"/>
-      <w:r>
-        <w:rPr>
-          <w:rFonts w:eastAsia="Arial Unicode MS"/>
-          <w:color w:val="000000"/>
-          <w:kern w:val="2"/>
-          <w:sz w:val="28"/>
-          <w:szCs w:val="28"/>
-          <w:bdr w:val="nil"/>
-        </w:rPr>
-        <w:t xml:space="preserve"> для швидкої обробки REST-запитів і запобігання проблеми N+1.</w:t>
-      </w:r>
-    </w:p>
-    <w:p>
-      <w:pPr>
-        <w:pStyle w:val="NormalWeb"/>
-        <w:spacing w:before="0" w:beforeAutospacing="0" w:after="0" w:afterAutospacing="0" w:line="360" w:lineRule="auto"/>
-        <w:ind w:firstLine="709"/>
-        <w:jc w:val="both"/>
-        <w:rPr>
-          <w:rFonts w:eastAsia="Arial Unicode MS"/>
-          <w:color w:val="000000"/>
-          <w:kern w:val="2"/>
-          <w:sz w:val="28"/>
-          <w:szCs w:val="28"/>
-          <w:bdr w:val="nil"/>
-        </w:rPr>
-      </w:pPr>
-      <w:r>
-        <w:rPr>
-          <w:rFonts w:eastAsia="Arial Unicode MS"/>
-          <w:color w:val="000000"/>
-          <w:kern w:val="2"/>
-          <w:sz w:val="28"/>
-          <w:szCs w:val="28"/>
-          <w:bdr w:val="nil"/>
-        </w:rPr>
-        <w:t>3.2.3 Масштабованість</w:t>
-      </w:r>
-    </w:p>
-    <w:p>
-      <w:pPr>
-        <w:pStyle w:val="NormalWeb"/>
-        <w:spacing w:before="0" w:beforeAutospacing="0" w:after="0" w:afterAutospacing="0" w:line="360" w:lineRule="auto"/>
-        <w:ind w:firstLine="709"/>
-        <w:jc w:val="both"/>
-        <w:rPr>
-          <w:rFonts w:eastAsia="Arial Unicode MS"/>
-          <w:color w:val="000000"/>
-          <w:kern w:val="2"/>
-          <w:sz w:val="28"/>
-          <w:szCs w:val="28"/>
-          <w:bdr w:val="nil"/>
-        </w:rPr>
-      </w:pPr>
-      <w:r>
-        <w:rPr>
-          <w:rFonts w:eastAsia="Arial Unicode MS"/>
-          <w:color w:val="000000"/>
-          <w:kern w:val="2"/>
-          <w:sz w:val="28"/>
-          <w:szCs w:val="28"/>
-          <w:bdr w:val="nil"/>
-        </w:rPr>
-        <w:t xml:space="preserve">Система запакована у </w:t>
-      </w:r>
-      <w:proofErr w:type="spellStart"/>
-      <w:r>
-        <w:rPr>
-          <w:rFonts w:eastAsia="Arial Unicode MS"/>
-          <w:color w:val="000000"/>
-          <w:kern w:val="2"/>
-          <w:sz w:val="28"/>
-          <w:szCs w:val="28"/>
-          <w:bdr w:val="nil"/>
-        </w:rPr>
-        <w:t>Docker</w:t>
-      </w:r>
-      <w:proofErr w:type="spellEnd"/>
-      <w:r>
-        <w:rPr>
-          <w:rFonts w:eastAsia="Arial Unicode MS"/>
-          <w:color w:val="000000"/>
-          <w:kern w:val="2"/>
-          <w:sz w:val="28"/>
-          <w:szCs w:val="28"/>
-          <w:bdr w:val="nil"/>
-        </w:rPr>
-        <w:t>-контейнери, що дозволяє легко переносити та масштабувати розгортання моноліту на будь-якому VPS-сервері.</w:t>
-      </w:r>
-    </w:p>
-    <w:p>
-      <w:pPr>
-        <w:pStyle w:val="NormalWeb"/>
-        <w:spacing w:before="0" w:beforeAutospacing="0" w:after="0" w:afterAutospacing="0" w:line="360" w:lineRule="auto"/>
-        <w:ind w:firstLine="709"/>
-        <w:jc w:val="both"/>
-        <w:rPr>
-          <w:rFonts w:eastAsia="Arial Unicode MS"/>
-          <w:color w:val="000000"/>
-          <w:kern w:val="2"/>
-          <w:sz w:val="28"/>
-          <w:szCs w:val="28"/>
-          <w:bdr w:val="nil"/>
-        </w:rPr>
-      </w:pPr>
-      <w:r>
-        <w:rPr>
-          <w:rFonts w:eastAsia="Arial Unicode MS"/>
-          <w:color w:val="000000"/>
-          <w:kern w:val="2"/>
-          <w:sz w:val="28"/>
-          <w:szCs w:val="28"/>
-          <w:bdr w:val="nil"/>
-        </w:rPr>
-        <w:t>3.2.4 Безпека</w:t>
-      </w:r>
-    </w:p>
-    <w:p>
-      <w:pPr>
-        <w:pStyle w:val="NormalWeb"/>
-        <w:spacing w:before="0" w:beforeAutospacing="0" w:after="0" w:afterAutospacing="0" w:line="360" w:lineRule="auto"/>
-        <w:ind w:firstLine="709"/>
-        <w:jc w:val="both"/>
-        <w:rPr>
-          <w:rFonts w:eastAsia="Arial Unicode MS"/>
-          <w:color w:val="000000"/>
-          <w:kern w:val="2"/>
-          <w:sz w:val="28"/>
-          <w:szCs w:val="28"/>
-          <w:bdr w:val="nil"/>
-        </w:rPr>
-      </w:pPr>
-      <w:r>
-        <w:rPr>
-          <w:rFonts w:eastAsia="Arial Unicode MS"/>
-          <w:color w:val="000000"/>
-          <w:kern w:val="2"/>
-          <w:sz w:val="28"/>
-          <w:szCs w:val="28"/>
-          <w:bdr w:val="nil"/>
-        </w:rPr>
-        <w:t>Захист API-</w:t>
-      </w:r>
-      <w:proofErr w:type="spellStart"/>
-      <w:r>
-        <w:rPr>
-          <w:rFonts w:eastAsia="Arial Unicode MS"/>
-          <w:color w:val="000000"/>
-          <w:kern w:val="2"/>
-          <w:sz w:val="28"/>
-          <w:szCs w:val="28"/>
-          <w:bdr w:val="nil"/>
-        </w:rPr>
-        <w:t>ендпоінтів</w:t>
-      </w:r>
-      <w:proofErr w:type="spellEnd"/>
-      <w:r>
-        <w:rPr>
-          <w:rFonts w:eastAsia="Arial Unicode MS"/>
-          <w:color w:val="000000"/>
-          <w:kern w:val="2"/>
-          <w:sz w:val="28"/>
-          <w:szCs w:val="28"/>
-          <w:bdr w:val="nil"/>
-        </w:rPr>
-        <w:t xml:space="preserve"> реалізовано за допомогою JSON </w:t>
-      </w:r>
-      <w:proofErr w:type="spellStart"/>
-      <w:r>
-        <w:rPr>
-          <w:rFonts w:eastAsia="Arial Unicode MS"/>
-          <w:color w:val="000000"/>
-          <w:kern w:val="2"/>
-          <w:sz w:val="28"/>
-          <w:szCs w:val="28"/>
-          <w:bdr w:val="nil"/>
-        </w:rPr>
-        <w:t>Web</w:t>
-      </w:r>
-      <w:proofErr w:type="spellEnd"/>
-      <w:r>
-        <w:rPr>
-          <w:rFonts w:eastAsia="Arial Unicode MS"/>
-          <w:color w:val="000000"/>
-          <w:kern w:val="2"/>
-          <w:sz w:val="28"/>
-          <w:szCs w:val="28"/>
-          <w:bdr w:val="nil"/>
-        </w:rPr>
-        <w:t xml:space="preserve"> </w:t>
-      </w:r>
-      <w:proofErr w:type="spellStart"/>
-      <w:r>
-        <w:rPr>
-          <w:rFonts w:eastAsia="Arial Unicode MS"/>
-          <w:color w:val="000000"/>
-          <w:kern w:val="2"/>
-          <w:sz w:val="28"/>
-          <w:szCs w:val="28"/>
-          <w:bdr w:val="nil"/>
-        </w:rPr>
-        <w:t>Tokens</w:t>
-      </w:r>
-      <w:proofErr w:type="spellEnd"/>
-      <w:r>
-        <w:rPr>
-          <w:rFonts w:eastAsia="Arial Unicode MS"/>
-          <w:color w:val="000000"/>
-          <w:kern w:val="2"/>
-          <w:sz w:val="28"/>
-          <w:szCs w:val="28"/>
-          <w:bdr w:val="nil"/>
-        </w:rPr>
-        <w:t>, які зберігаються у захищених HTTP-</w:t>
-      </w:r>
-      <w:proofErr w:type="spellStart"/>
-      <w:r>
-        <w:rPr>
-          <w:rFonts w:eastAsia="Arial Unicode MS"/>
-          <w:color w:val="000000"/>
-          <w:kern w:val="2"/>
-          <w:sz w:val="28"/>
-          <w:szCs w:val="28"/>
-          <w:bdr w:val="nil"/>
-        </w:rPr>
-        <w:t>only</w:t>
-      </w:r>
-      <w:proofErr w:type="spellEnd"/>
-      <w:r>
-        <w:rPr>
-          <w:rFonts w:eastAsia="Arial Unicode MS"/>
-          <w:color w:val="000000"/>
-          <w:kern w:val="2"/>
-          <w:sz w:val="28"/>
-          <w:szCs w:val="28"/>
-          <w:bdr w:val="nil"/>
-        </w:rPr>
-        <w:t xml:space="preserve"> </w:t>
-      </w:r>
-      <w:proofErr w:type="spellStart"/>
-      <w:r>
-        <w:rPr>
-          <w:rFonts w:eastAsia="Arial Unicode MS"/>
-          <w:color w:val="000000"/>
-          <w:kern w:val="2"/>
-          <w:sz w:val="28"/>
-          <w:szCs w:val="28"/>
-          <w:bdr w:val="nil"/>
-        </w:rPr>
-        <w:t>cookies</w:t>
-      </w:r>
-      <w:proofErr w:type="spellEnd"/>
-      <w:r>
-        <w:rPr>
-          <w:rFonts w:eastAsia="Arial Unicode MS"/>
-          <w:color w:val="000000"/>
-          <w:kern w:val="2"/>
-          <w:sz w:val="28"/>
-          <w:szCs w:val="28"/>
-          <w:bdr w:val="nil"/>
-        </w:rPr>
-        <w:t>, що унеможливлює XSS-атаки на клієнтські сесії.</w:t>
-      </w:r>
-    </w:p>
-    <w:p>
-      <w:pPr>
-        <w:pStyle w:val="NormalWeb"/>
-        <w:spacing w:before="0" w:beforeAutospacing="0" w:after="0" w:afterAutospacing="0" w:line="360" w:lineRule="auto"/>
-        <w:ind w:firstLine="709"/>
-        <w:jc w:val="both"/>
-        <w:rPr>
-          <w:rFonts w:eastAsia="Arial Unicode MS"/>
-          <w:color w:val="000000"/>
-          <w:kern w:val="2"/>
-          <w:sz w:val="28"/>
-          <w:szCs w:val="28"/>
-          <w:bdr w:val="nil"/>
-        </w:rPr>
-      </w:pPr>
-      <w:r>
-        <w:rPr>
-          <w:rFonts w:eastAsia="Arial Unicode MS"/>
-          <w:color w:val="000000"/>
-          <w:kern w:val="2"/>
-          <w:sz w:val="28"/>
-          <w:szCs w:val="28"/>
-          <w:bdr w:val="nil"/>
-        </w:rPr>
-        <w:t xml:space="preserve">3.2.5 Зручність використання Клієнтський інтерфейс, побудований на базі бібліотек </w:t>
-      </w:r>
-      <w:proofErr w:type="spellStart"/>
-      <w:r>
-        <w:rPr>
-          <w:rFonts w:eastAsia="Arial Unicode MS"/>
-          <w:color w:val="000000"/>
-          <w:kern w:val="2"/>
-          <w:sz w:val="28"/>
-          <w:szCs w:val="28"/>
-          <w:bdr w:val="nil"/>
-        </w:rPr>
-        <w:t>React</w:t>
-      </w:r>
-      <w:proofErr w:type="spellEnd"/>
-      <w:r>
-        <w:rPr>
-          <w:rFonts w:eastAsia="Arial Unicode MS"/>
-          <w:color w:val="000000"/>
-          <w:kern w:val="2"/>
-          <w:sz w:val="28"/>
-          <w:szCs w:val="28"/>
-          <w:bdr w:val="nil"/>
-        </w:rPr>
-        <w:t xml:space="preserve"> та </w:t>
-      </w:r>
-      <w:proofErr w:type="spellStart"/>
-      <w:r>
-        <w:rPr>
-          <w:rFonts w:eastAsia="Arial Unicode MS"/>
-          <w:color w:val="000000"/>
-          <w:kern w:val="2"/>
-          <w:sz w:val="28"/>
-          <w:szCs w:val="28"/>
-          <w:bdr w:val="nil"/>
-        </w:rPr>
-        <w:t>Material</w:t>
-      </w:r>
-      <w:proofErr w:type="spellEnd"/>
-      <w:r>
-        <w:rPr>
-          <w:rFonts w:eastAsia="Arial Unicode MS"/>
-          <w:color w:val="000000"/>
-          <w:kern w:val="2"/>
-          <w:sz w:val="28"/>
-          <w:szCs w:val="28"/>
-          <w:bdr w:val="nil"/>
-        </w:rPr>
-        <w:t xml:space="preserve"> UI, забезпечуватиме інтуїтивно зрозумілу навігацію та адаптивний дизайн, повністю сумісний із мобільними і </w:t>
-      </w:r>
-      <w:proofErr w:type="spellStart"/>
-      <w:r>
-        <w:rPr>
-          <w:rFonts w:eastAsia="Arial Unicode MS"/>
-          <w:color w:val="000000"/>
-          <w:kern w:val="2"/>
-          <w:sz w:val="28"/>
-          <w:szCs w:val="28"/>
-          <w:bdr w:val="nil"/>
-        </w:rPr>
-        <w:t>десктопними</w:t>
-      </w:r>
-      <w:proofErr w:type="spellEnd"/>
-      <w:r>
-        <w:rPr>
-          <w:rFonts w:eastAsia="Arial Unicode MS"/>
-          <w:color w:val="000000"/>
-          <w:kern w:val="2"/>
-          <w:sz w:val="28"/>
-          <w:szCs w:val="28"/>
-          <w:bdr w:val="nil"/>
-        </w:rPr>
-        <w:t xml:space="preserve"> пристроями. Користувачі отримуватимуть оперативний зворотний зв’язок під час пошуку товарів або налаштування </w:t>
-      </w:r>
-      <w:proofErr w:type="spellStart"/>
-      <w:r>
-        <w:rPr>
-          <w:rFonts w:eastAsia="Arial Unicode MS"/>
-          <w:color w:val="000000"/>
-          <w:kern w:val="2"/>
-          <w:sz w:val="28"/>
-          <w:szCs w:val="28"/>
-          <w:bdr w:val="nil"/>
-        </w:rPr>
-        <w:t>трекерів</w:t>
-      </w:r>
-      <w:proofErr w:type="spellEnd"/>
-      <w:r>
-        <w:rPr>
-          <w:rFonts w:eastAsia="Arial Unicode MS"/>
-          <w:color w:val="000000"/>
-          <w:kern w:val="2"/>
-          <w:sz w:val="28"/>
-          <w:szCs w:val="28"/>
-          <w:bdr w:val="nil"/>
-        </w:rPr>
-        <w:t>, а кількість кроків для доступу до візуалізації часових рядів буде мінімізована.</w:t>
-      </w:r>
-    </w:p>
-    <w:p>
-      <w:pPr>
-        <w:pStyle w:val="NormalWeb"/>
-        <w:spacing w:before="0" w:beforeAutospacing="0" w:after="0" w:afterAutospacing="0" w:line="360" w:lineRule="auto"/>
-        <w:ind w:firstLine="709"/>
-        <w:jc w:val="both"/>
-        <w:rPr>
-          <w:rFonts w:eastAsia="Arial Unicode MS"/>
-          <w:color w:val="000000"/>
-          <w:kern w:val="2"/>
-          <w:sz w:val="28"/>
-          <w:szCs w:val="28"/>
-          <w:bdr w:val="nil"/>
-        </w:rPr>
-      </w:pPr>
-      <w:r>
-        <w:rPr>
-          <w:rFonts w:eastAsia="Arial Unicode MS"/>
-          <w:color w:val="000000"/>
-          <w:kern w:val="2"/>
-          <w:sz w:val="28"/>
-          <w:szCs w:val="28"/>
-          <w:bdr w:val="nil"/>
-        </w:rPr>
-        <w:t xml:space="preserve">3.2.6 Портативність </w:t>
-      </w:r>
-    </w:p>
-    <w:p>
-      <w:pPr>
-        <w:pStyle w:val="NormalWeb"/>
-        <w:spacing w:before="0" w:beforeAutospacing="0" w:after="0" w:afterAutospacing="0" w:line="360" w:lineRule="auto"/>
-        <w:ind w:firstLine="709"/>
-        <w:jc w:val="both"/>
-        <w:rPr>
-          <w:rFonts w:eastAsia="Arial Unicode MS"/>
-          <w:color w:val="000000"/>
-          <w:kern w:val="2"/>
-          <w:sz w:val="28"/>
-          <w:szCs w:val="28"/>
-          <w:bdr w:val="nil"/>
-        </w:rPr>
-      </w:pPr>
-      <w:r>
-        <w:rPr>
-          <w:rFonts w:eastAsia="Arial Unicode MS"/>
-          <w:color w:val="000000"/>
-          <w:kern w:val="2"/>
-          <w:sz w:val="28"/>
-          <w:szCs w:val="28"/>
-          <w:bdr w:val="nil"/>
-        </w:rPr>
-        <w:t xml:space="preserve">Платформа розгортатиметься у </w:t>
-      </w:r>
-      <w:proofErr w:type="spellStart"/>
-      <w:r>
-        <w:rPr>
-          <w:rFonts w:eastAsia="Arial Unicode MS"/>
-          <w:color w:val="000000"/>
-          <w:kern w:val="2"/>
-          <w:sz w:val="28"/>
-          <w:szCs w:val="28"/>
-          <w:bdr w:val="nil"/>
-        </w:rPr>
-        <w:t>контейнеризованому</w:t>
-      </w:r>
-      <w:proofErr w:type="spellEnd"/>
-      <w:r>
-        <w:rPr>
-          <w:rFonts w:eastAsia="Arial Unicode MS"/>
-          <w:color w:val="000000"/>
-          <w:kern w:val="2"/>
-          <w:sz w:val="28"/>
-          <w:szCs w:val="28"/>
-          <w:bdr w:val="nil"/>
-        </w:rPr>
-        <w:t xml:space="preserve"> середовищі на базі </w:t>
-      </w:r>
-      <w:proofErr w:type="spellStart"/>
-      <w:r>
-        <w:rPr>
-          <w:rFonts w:eastAsia="Arial Unicode MS"/>
-          <w:color w:val="000000"/>
-          <w:kern w:val="2"/>
-          <w:sz w:val="28"/>
-          <w:szCs w:val="28"/>
-          <w:bdr w:val="nil"/>
-        </w:rPr>
-        <w:t>Docker</w:t>
-      </w:r>
-      <w:proofErr w:type="spellEnd"/>
-      <w:r>
-        <w:rPr>
-          <w:rFonts w:eastAsia="Arial Unicode MS"/>
-          <w:color w:val="000000"/>
-          <w:kern w:val="2"/>
-          <w:sz w:val="28"/>
-          <w:szCs w:val="28"/>
-          <w:bdr w:val="nil"/>
-        </w:rPr>
-        <w:t xml:space="preserve"> та оркеструватиметься за допомогою </w:t>
-      </w:r>
-      <w:proofErr w:type="spellStart"/>
-      <w:r>
-        <w:rPr>
-          <w:rFonts w:eastAsia="Arial Unicode MS"/>
-          <w:color w:val="000000"/>
-          <w:kern w:val="2"/>
-          <w:sz w:val="28"/>
-          <w:szCs w:val="28"/>
-          <w:bdr w:val="nil"/>
-        </w:rPr>
-        <w:t>docker-compose</w:t>
-      </w:r>
-      <w:proofErr w:type="spellEnd"/>
-      <w:r>
-        <w:rPr>
-          <w:rFonts w:eastAsia="Arial Unicode MS"/>
-          <w:color w:val="000000"/>
-          <w:kern w:val="2"/>
-          <w:sz w:val="28"/>
-          <w:szCs w:val="28"/>
-          <w:bdr w:val="nil"/>
-        </w:rPr>
-        <w:t xml:space="preserve">, що забезпечить </w:t>
-      </w:r>
-      <w:r>
-        <w:rPr>
-          <w:rFonts w:eastAsia="Arial Unicode MS"/>
-          <w:color w:val="000000"/>
-          <w:kern w:val="2"/>
-          <w:sz w:val="28"/>
-          <w:szCs w:val="28"/>
-          <w:bdr w:val="nil"/>
+        <w:t>після завершення циклу збору даних екземпляри браузера обов'язково закриваються для уникнення витоків пам'яті (memory leaks).</w:t>
+      </w:r>
+    </w:p>
+    <w:p>
+      <w:pPr>
+        <w:pBdr>
+          <w:top w:val="none" w:sz="0" w:space="0" w:color="auto"/>
+          <w:left w:val="none" w:sz="0" w:space="0" w:color="auto"/>
+          <w:bottom w:val="none" w:sz="0" w:space="0" w:color="auto"/>
+          <w:right w:val="none" w:sz="0" w:space="0" w:color="auto"/>
+          <w:between w:val="none" w:sz="0" w:space="0" w:color="auto"/>
+          <w:bar w:val="none" w:sz="0" w:color="auto"/>
+        </w:pBdr>
+        <w:rPr>
+          <w:rFonts w:cs="Times New Roman"/>
+        </w:rPr>
+      </w:pPr>
+      <w:r>
+        <w:rPr>
+          <w:rFonts w:cs="Times New Roman"/>
+        </w:rPr>
+        <w:t xml:space="preserve">3.2.3 Комунікаційний протокол </w:t>
+      </w:r>
+    </w:p>
+    <w:p>
+      <w:pPr>
+        <w:pBdr>
+          <w:top w:val="none" w:sz="0" w:space="0" w:color="auto"/>
+          <w:left w:val="none" w:sz="0" w:space="0" w:color="auto"/>
+          <w:bottom w:val="none" w:sz="0" w:space="0" w:color="auto"/>
+          <w:right w:val="none" w:sz="0" w:space="0" w:color="auto"/>
+          <w:between w:val="none" w:sz="0" w:space="0" w:color="auto"/>
+          <w:bar w:val="none" w:sz="0" w:color="auto"/>
+        </w:pBdr>
+        <w:rPr>
+          <w:rFonts w:cs="Times New Roman"/>
+        </w:rPr>
+      </w:pPr>
+      <w:r>
+        <w:rPr>
+          <w:rFonts w:cs="Times New Roman"/>
+        </w:rPr>
+        <w:t xml:space="preserve">– HTTPS (HTTP/1.1) – для обміну даними між клієнтом та REST API; </w:t>
+      </w:r>
+    </w:p>
+    <w:p>
+      <w:pPr>
+        <w:pBdr>
+          <w:top w:val="none" w:sz="0" w:space="0" w:color="auto"/>
+          <w:left w:val="none" w:sz="0" w:space="0" w:color="auto"/>
+          <w:bottom w:val="none" w:sz="0" w:space="0" w:color="auto"/>
+          <w:right w:val="none" w:sz="0" w:space="0" w:color="auto"/>
+          <w:between w:val="none" w:sz="0" w:space="0" w:color="auto"/>
+          <w:bar w:val="none" w:sz="0" w:color="auto"/>
+        </w:pBdr>
+        <w:rPr>
+          <w:rFonts w:cs="Times New Roman"/>
+        </w:rPr>
+      </w:pPr>
+      <w:r>
+        <w:rPr>
+          <w:rFonts w:cs="Times New Roman"/>
+        </w:rPr>
+        <w:t>– TCP/IP – базовий транспортний рівень.</w:t>
+      </w:r>
+    </w:p>
+    <w:p>
+      <w:pPr>
+        <w:pBdr>
+          <w:top w:val="none" w:sz="0" w:space="0" w:color="auto"/>
+          <w:left w:val="none" w:sz="0" w:space="0" w:color="auto"/>
+          <w:bottom w:val="none" w:sz="0" w:space="0" w:color="auto"/>
+          <w:right w:val="none" w:sz="0" w:space="0" w:color="auto"/>
+          <w:between w:val="none" w:sz="0" w:space="0" w:color="auto"/>
+          <w:bar w:val="none" w:sz="0" w:color="auto"/>
+        </w:pBdr>
+        <w:rPr>
+          <w:rFonts w:cs="Times New Roman"/>
+        </w:rPr>
+      </w:pPr>
+      <w:r>
+        <w:rPr>
+          <w:rFonts w:cs="Times New Roman"/>
+        </w:rPr>
+        <w:t>3.3 Програмні вимоги</w:t>
+      </w:r>
+    </w:p>
+    <w:p>
+      <w:pPr>
+        <w:pBdr>
+          <w:top w:val="none" w:sz="0" w:space="0" w:color="auto"/>
+          <w:left w:val="none" w:sz="0" w:space="0" w:color="auto"/>
+          <w:bottom w:val="none" w:sz="0" w:space="0" w:color="auto"/>
+          <w:right w:val="none" w:sz="0" w:space="0" w:color="auto"/>
+          <w:between w:val="none" w:sz="0" w:space="0" w:color="auto"/>
+          <w:bar w:val="none" w:sz="0" w:color="auto"/>
+        </w:pBdr>
+        <w:rPr>
+          <w:rFonts w:cs="Times New Roman"/>
+        </w:rPr>
+      </w:pPr>
+      <w:r>
+        <w:rPr>
+          <w:rFonts w:cs="Times New Roman"/>
+        </w:rPr>
+        <w:t xml:space="preserve">3.3.1 Програмний інтерфейс </w:t>
+      </w:r>
+    </w:p>
+    <w:p>
+      <w:pPr>
+        <w:pBdr>
+          <w:top w:val="none" w:sz="0" w:space="0" w:color="auto"/>
+          <w:left w:val="none" w:sz="0" w:space="0" w:color="auto"/>
+          <w:bottom w:val="none" w:sz="0" w:space="0" w:color="auto"/>
+          <w:right w:val="none" w:sz="0" w:space="0" w:color="auto"/>
+          <w:between w:val="none" w:sz="0" w:space="0" w:color="auto"/>
+          <w:bar w:val="none" w:sz="0" w:color="auto"/>
+        </w:pBdr>
+        <w:rPr>
+          <w:rFonts w:cs="Times New Roman"/>
+        </w:rPr>
+      </w:pPr>
+      <w:r>
+        <w:rPr>
+          <w:rFonts w:cs="Times New Roman"/>
+        </w:rPr>
+        <w:t>Взаємодія між клієнтською (React) та серверною (Node.js) частинами відбувається через REST API. Формат обміну даними – JSON. Взаємодія з базою даних здійснюється через ORM-бібліотеку TypeORM.</w:t>
+      </w:r>
+    </w:p>
+    <w:p>
+      <w:pPr>
+        <w:pBdr>
+          <w:top w:val="none" w:sz="0" w:space="0" w:color="auto"/>
+          <w:left w:val="none" w:sz="0" w:space="0" w:color="auto"/>
+          <w:bottom w:val="none" w:sz="0" w:space="0" w:color="auto"/>
+          <w:right w:val="none" w:sz="0" w:space="0" w:color="auto"/>
+          <w:between w:val="none" w:sz="0" w:space="0" w:color="auto"/>
+          <w:bar w:val="none" w:sz="0" w:color="auto"/>
+        </w:pBdr>
+        <w:rPr>
+          <w:rFonts w:cs="Times New Roman"/>
+        </w:rPr>
+      </w:pPr>
+      <w:r>
+        <w:rPr>
+          <w:rFonts w:cs="Times New Roman"/>
+        </w:rPr>
+        <w:t xml:space="preserve">3.3.2 Операції </w:t>
+      </w:r>
+    </w:p>
+    <w:p>
+      <w:pPr>
+        <w:pBdr>
+          <w:top w:val="none" w:sz="0" w:space="0" w:color="auto"/>
+          <w:left w:val="none" w:sz="0" w:space="0" w:color="auto"/>
+          <w:bottom w:val="none" w:sz="0" w:space="0" w:color="auto"/>
+          <w:right w:val="none" w:sz="0" w:space="0" w:color="auto"/>
+          <w:between w:val="none" w:sz="0" w:space="0" w:color="auto"/>
+          <w:bar w:val="none" w:sz="0" w:color="auto"/>
+        </w:pBdr>
+        <w:rPr>
+          <w:rFonts w:cs="Times New Roman"/>
+        </w:rPr>
+      </w:pPr>
+      <w:r>
+        <w:rPr>
+          <w:rFonts w:cs="Times New Roman"/>
+        </w:rPr>
+        <w:t>Базові операції включають: запуск фонової задачі скрапінгу (cron jobs)</w:t>
+      </w:r>
+      <w:r>
+        <w:rPr>
+          <w:rFonts w:cs="Times New Roman"/>
+        </w:rPr>
+        <w:t xml:space="preserve"> наявного контенту</w:t>
+      </w:r>
+      <w:r>
+        <w:rPr>
+          <w:rFonts w:cs="Times New Roman"/>
+        </w:rPr>
+        <w:t>, нормалізацію отриманого HTML-коду, запис нових точок часового ряду в БД, обробку клієнтських запитів на отримання статистичних агрегацій.</w:t>
+      </w:r>
+    </w:p>
+    <w:p>
+      <w:pPr>
+        <w:pBdr>
+          <w:top w:val="none" w:sz="0" w:space="0" w:color="auto"/>
+          <w:left w:val="none" w:sz="0" w:space="0" w:color="auto"/>
+          <w:bottom w:val="none" w:sz="0" w:space="0" w:color="auto"/>
+          <w:right w:val="none" w:sz="0" w:space="0" w:color="auto"/>
+          <w:between w:val="none" w:sz="0" w:space="0" w:color="auto"/>
+          <w:bar w:val="none" w:sz="0" w:color="auto"/>
+        </w:pBdr>
+        <w:rPr>
+          <w:rFonts w:cs="Times New Roman"/>
+        </w:rPr>
+      </w:pPr>
+      <w:r>
+        <w:rPr>
+          <w:rFonts w:cs="Times New Roman"/>
+        </w:rPr>
+        <w:t xml:space="preserve">3.3.3 Надійність </w:t>
+      </w:r>
+    </w:p>
+    <w:p>
+      <w:pPr>
+        <w:pBdr>
+          <w:top w:val="none" w:sz="0" w:space="0" w:color="auto"/>
+          <w:left w:val="none" w:sz="0" w:space="0" w:color="auto"/>
+          <w:bottom w:val="none" w:sz="0" w:space="0" w:color="auto"/>
+          <w:right w:val="none" w:sz="0" w:space="0" w:color="auto"/>
+          <w:between w:val="none" w:sz="0" w:space="0" w:color="auto"/>
+          <w:bar w:val="none" w:sz="0" w:color="auto"/>
+        </w:pBdr>
+        <w:rPr>
+          <w:rFonts w:cs="Times New Roman"/>
+        </w:rPr>
+      </w:pPr>
+      <w:r>
+        <w:rPr>
+          <w:rFonts w:cs="Times New Roman"/>
+        </w:rPr>
+        <w:t>Стійкість до помилок парсингу: у разі неможливості зчитати ціну (наприклад, товар відсутній або змінено верстку), система не перериває загальний процес, а логує помилку та переходить до наступного товару.</w:t>
+      </w:r>
+    </w:p>
+    <w:p>
+      <w:pPr>
+        <w:pBdr>
+          <w:top w:val="none" w:sz="0" w:space="0" w:color="auto"/>
+          <w:left w:val="none" w:sz="0" w:space="0" w:color="auto"/>
+          <w:bottom w:val="none" w:sz="0" w:space="0" w:color="auto"/>
+          <w:right w:val="none" w:sz="0" w:space="0" w:color="auto"/>
+          <w:between w:val="none" w:sz="0" w:space="0" w:color="auto"/>
+          <w:bar w:val="none" w:sz="0" w:color="auto"/>
+        </w:pBdr>
+        <w:rPr>
+          <w:rFonts w:cs="Times New Roman"/>
+        </w:rPr>
+      </w:pPr>
+      <w:r>
+        <w:rPr>
+          <w:rFonts w:cs="Times New Roman"/>
+        </w:rPr>
+        <w:t xml:space="preserve">3.3.4 Продуктивність </w:t>
+      </w:r>
+    </w:p>
+    <w:p>
+      <w:pPr>
+        <w:pBdr>
+          <w:top w:val="none" w:sz="0" w:space="0" w:color="auto"/>
+          <w:left w:val="none" w:sz="0" w:space="0" w:color="auto"/>
+          <w:bottom w:val="none" w:sz="0" w:space="0" w:color="auto"/>
+          <w:right w:val="none" w:sz="0" w:space="0" w:color="auto"/>
+          <w:between w:val="none" w:sz="0" w:space="0" w:color="auto"/>
+          <w:bar w:val="none" w:sz="0" w:color="auto"/>
+        </w:pBdr>
+        <w:rPr>
+          <w:rFonts w:cs="Times New Roman"/>
+        </w:rPr>
+      </w:pPr>
+      <w:r>
+        <w:rPr>
+          <w:rFonts w:cs="Times New Roman"/>
+        </w:rPr>
+        <w:t>Використання індексації ключових полів бази даних (наприклад, артикулів, ідентифікаторів товарів) та застосування Connection Pooling для швидкої обробки REST-запитів і запобігання проблеми N+1.</w:t>
+      </w:r>
+    </w:p>
+    <w:p>
+      <w:pPr>
+        <w:pBdr>
+          <w:top w:val="none" w:sz="0" w:space="0" w:color="auto"/>
+          <w:left w:val="none" w:sz="0" w:space="0" w:color="auto"/>
+          <w:bottom w:val="none" w:sz="0" w:space="0" w:color="auto"/>
+          <w:right w:val="none" w:sz="0" w:space="0" w:color="auto"/>
+          <w:between w:val="none" w:sz="0" w:space="0" w:color="auto"/>
+          <w:bar w:val="none" w:sz="0" w:color="auto"/>
+        </w:pBdr>
+        <w:rPr>
+          <w:rFonts w:cs="Times New Roman"/>
+        </w:rPr>
+      </w:pPr>
+      <w:r>
+        <w:rPr>
+          <w:rFonts w:cs="Times New Roman"/>
+        </w:rPr>
+        <w:t xml:space="preserve">3.3.5 Безпека </w:t>
+      </w:r>
+    </w:p>
+    <w:p>
+      <w:pPr>
+        <w:pBdr>
+          <w:top w:val="none" w:sz="0" w:space="0" w:color="auto"/>
+          <w:left w:val="none" w:sz="0" w:space="0" w:color="auto"/>
+          <w:bottom w:val="none" w:sz="0" w:space="0" w:color="auto"/>
+          <w:right w:val="none" w:sz="0" w:space="0" w:color="auto"/>
+          <w:between w:val="none" w:sz="0" w:space="0" w:color="auto"/>
+          <w:bar w:val="none" w:sz="0" w:color="auto"/>
+        </w:pBdr>
+        <w:rPr>
+          <w:rFonts w:cs="Times New Roman"/>
+        </w:rPr>
+      </w:pPr>
+      <w:r>
+        <w:rPr>
+          <w:rFonts w:cs="Times New Roman"/>
+        </w:rPr>
+        <w:t>Захист API-ендпоінтів реалізовано за допомогою JSON Web Tokens, які зберігаються у захищених HTTP-only cookies, що унеможливлює XSS-атаки на клієнтські сесії. Зберігання паролів користувачів у базі даних має здійснюватися у безпечному хешованому вигляді з використанням адаптивного алгоритму bcrypt (із застосуванням криптографічної солі).</w:t>
+      </w:r>
+    </w:p>
+    <w:p>
+      <w:pPr>
+        <w:pBdr>
+          <w:top w:val="none" w:sz="0" w:space="0" w:color="auto"/>
+          <w:left w:val="none" w:sz="0" w:space="0" w:color="auto"/>
+          <w:bottom w:val="none" w:sz="0" w:space="0" w:color="auto"/>
+          <w:right w:val="none" w:sz="0" w:space="0" w:color="auto"/>
+          <w:between w:val="none" w:sz="0" w:space="0" w:color="auto"/>
+          <w:bar w:val="none" w:sz="0" w:color="auto"/>
+        </w:pBdr>
+        <w:rPr>
+          <w:rFonts w:cs="Times New Roman"/>
+        </w:rPr>
+      </w:pPr>
+      <w:r>
+        <w:rPr>
+          <w:rFonts w:cs="Times New Roman"/>
         </w:rPr>
         <w:lastRenderedPageBreak/>
-        <w:t xml:space="preserve">легку переносимість між будь-якими хмарними провайдерами (VPS/VDS серверами) без прив'язки до конкретної інфраструктури. </w:t>
-      </w:r>
-      <w:proofErr w:type="spellStart"/>
-      <w:r>
-        <w:rPr>
-          <w:rFonts w:eastAsia="Arial Unicode MS"/>
-          <w:color w:val="000000"/>
-          <w:kern w:val="2"/>
-          <w:sz w:val="28"/>
-          <w:szCs w:val="28"/>
-          <w:bdr w:val="nil"/>
-        </w:rPr>
-        <w:t>Фронтенд</w:t>
-      </w:r>
-      <w:proofErr w:type="spellEnd"/>
-      <w:r>
-        <w:rPr>
-          <w:rFonts w:eastAsia="Arial Unicode MS"/>
-          <w:color w:val="000000"/>
-          <w:kern w:val="2"/>
-          <w:sz w:val="28"/>
-          <w:szCs w:val="28"/>
-          <w:bdr w:val="nil"/>
-        </w:rPr>
-        <w:t xml:space="preserve"> реалізовуватиметься як </w:t>
-      </w:r>
-      <w:proofErr w:type="spellStart"/>
-      <w:r>
-        <w:rPr>
-          <w:rFonts w:eastAsia="Arial Unicode MS"/>
-          <w:color w:val="000000"/>
-          <w:kern w:val="2"/>
-          <w:sz w:val="28"/>
-          <w:szCs w:val="28"/>
-          <w:bdr w:val="nil"/>
-        </w:rPr>
-        <w:t>кросплатформний</w:t>
-      </w:r>
-      <w:proofErr w:type="spellEnd"/>
-      <w:r>
-        <w:rPr>
-          <w:rFonts w:eastAsia="Arial Unicode MS"/>
-          <w:color w:val="000000"/>
-          <w:kern w:val="2"/>
-          <w:sz w:val="28"/>
-          <w:szCs w:val="28"/>
-          <w:bdr w:val="nil"/>
-        </w:rPr>
-        <w:t xml:space="preserve"> </w:t>
-      </w:r>
-      <w:proofErr w:type="spellStart"/>
-      <w:r>
-        <w:rPr>
-          <w:rFonts w:eastAsia="Arial Unicode MS"/>
-          <w:color w:val="000000"/>
-          <w:kern w:val="2"/>
-          <w:sz w:val="28"/>
-          <w:szCs w:val="28"/>
-          <w:bdr w:val="nil"/>
-        </w:rPr>
-        <w:t>вебзастосунок</w:t>
-      </w:r>
-      <w:proofErr w:type="spellEnd"/>
-      <w:r>
-        <w:rPr>
-          <w:rFonts w:eastAsia="Arial Unicode MS"/>
-          <w:color w:val="000000"/>
-          <w:kern w:val="2"/>
-          <w:sz w:val="28"/>
-          <w:szCs w:val="28"/>
-          <w:bdr w:val="nil"/>
-        </w:rPr>
-        <w:t>, сумісний із сучасними браузерами на всіх основних операційних системах.</w:t>
-      </w:r>
-    </w:p>
-    <w:p>
-      <w:pPr>
-        <w:pStyle w:val="NormalWeb"/>
-        <w:spacing w:before="0" w:beforeAutospacing="0" w:after="0" w:afterAutospacing="0" w:line="360" w:lineRule="auto"/>
-        <w:ind w:firstLine="709"/>
-        <w:jc w:val="both"/>
-        <w:rPr>
-          <w:rFonts w:eastAsia="Arial Unicode MS"/>
-          <w:color w:val="000000"/>
-          <w:kern w:val="2"/>
-          <w:sz w:val="28"/>
-          <w:szCs w:val="28"/>
-          <w:bdr w:val="nil"/>
-        </w:rPr>
-      </w:pPr>
-      <w:r>
-        <w:rPr>
-          <w:rFonts w:eastAsia="Arial Unicode MS"/>
-          <w:color w:val="000000"/>
-          <w:kern w:val="2"/>
-          <w:sz w:val="28"/>
-          <w:szCs w:val="28"/>
-          <w:bdr w:val="nil"/>
-        </w:rPr>
-        <w:t xml:space="preserve">3.2.7 </w:t>
-      </w:r>
-      <w:proofErr w:type="spellStart"/>
-      <w:r>
-        <w:rPr>
-          <w:rFonts w:eastAsia="Arial Unicode MS"/>
-          <w:color w:val="000000"/>
-          <w:kern w:val="2"/>
-          <w:sz w:val="28"/>
-          <w:szCs w:val="28"/>
-          <w:bdr w:val="nil"/>
-        </w:rPr>
-        <w:t>Підтримуваність</w:t>
-      </w:r>
-      <w:proofErr w:type="spellEnd"/>
-    </w:p>
-    <w:p>
-      <w:pPr>
-        <w:pStyle w:val="NormalWeb"/>
-        <w:spacing w:before="0" w:beforeAutospacing="0" w:after="0" w:afterAutospacing="0" w:line="360" w:lineRule="auto"/>
-        <w:ind w:firstLine="709"/>
-        <w:jc w:val="both"/>
-        <w:rPr>
-          <w:rFonts w:eastAsia="Arial Unicode MS"/>
-          <w:color w:val="000000"/>
-          <w:kern w:val="2"/>
-          <w:sz w:val="28"/>
-          <w:szCs w:val="28"/>
-          <w:bdr w:val="nil"/>
-        </w:rPr>
-      </w:pPr>
-      <w:r>
-        <w:rPr>
-          <w:rFonts w:eastAsia="Arial Unicode MS"/>
-          <w:color w:val="000000"/>
-          <w:kern w:val="2"/>
-          <w:sz w:val="28"/>
-          <w:szCs w:val="28"/>
-          <w:bdr w:val="nil"/>
-        </w:rPr>
-        <w:t xml:space="preserve">Використання </w:t>
-      </w:r>
-      <w:proofErr w:type="spellStart"/>
-      <w:r>
-        <w:rPr>
-          <w:rFonts w:eastAsia="Arial Unicode MS"/>
-          <w:color w:val="000000"/>
-          <w:kern w:val="2"/>
-          <w:sz w:val="28"/>
-          <w:szCs w:val="28"/>
-          <w:bdr w:val="nil"/>
-        </w:rPr>
-        <w:t>TypeScript</w:t>
-      </w:r>
-      <w:proofErr w:type="spellEnd"/>
-      <w:r>
-        <w:rPr>
-          <w:rFonts w:eastAsia="Arial Unicode MS"/>
-          <w:color w:val="000000"/>
-          <w:kern w:val="2"/>
-          <w:sz w:val="28"/>
-          <w:szCs w:val="28"/>
-          <w:bdr w:val="nil"/>
-        </w:rPr>
-        <w:t xml:space="preserve"> на обох рівнях (клієнт/сервер) забезпечує сувору типізацію та знижує кількість помилок на етапі розробки, спрощуючи подальшу підтримку коду.</w:t>
+        <w:t xml:space="preserve">3.3.6 Масштабованість та портативність </w:t>
+      </w:r>
+    </w:p>
+    <w:p>
+      <w:pPr>
+        <w:pBdr>
+          <w:top w:val="none" w:sz="0" w:space="0" w:color="auto"/>
+          <w:left w:val="none" w:sz="0" w:space="0" w:color="auto"/>
+          <w:bottom w:val="none" w:sz="0" w:space="0" w:color="auto"/>
+          <w:right w:val="none" w:sz="0" w:space="0" w:color="auto"/>
+          <w:between w:val="none" w:sz="0" w:space="0" w:color="auto"/>
+          <w:bar w:val="none" w:sz="0" w:color="auto"/>
+        </w:pBdr>
+        <w:rPr>
+          <w:rFonts w:cs="Times New Roman"/>
+        </w:rPr>
+      </w:pPr>
+      <w:r>
+        <w:rPr>
+          <w:rFonts w:cs="Times New Roman"/>
+        </w:rPr>
+        <w:t>Система запакована у Docker-контейнери, що дозволяє легко переносити та масштабувати розгортання моноліту на будь-якому VPS-сервері без прив'язки до конкретної інфраструктури. Фронтенд реалізовуватиметься як кросплатформний вебзастосунок, сумісний із сучасними браузерами на всіх основних операційних системах.</w:t>
+      </w:r>
+    </w:p>
+    <w:p>
+      <w:pPr>
+        <w:pBdr>
+          <w:top w:val="none" w:sz="0" w:space="0" w:color="auto"/>
+          <w:left w:val="none" w:sz="0" w:space="0" w:color="auto"/>
+          <w:bottom w:val="none" w:sz="0" w:space="0" w:color="auto"/>
+          <w:right w:val="none" w:sz="0" w:space="0" w:color="auto"/>
+          <w:between w:val="none" w:sz="0" w:space="0" w:color="auto"/>
+          <w:bar w:val="none" w:sz="0" w:color="auto"/>
+        </w:pBdr>
+        <w:rPr>
+          <w:rFonts w:cs="Times New Roman"/>
+        </w:rPr>
+      </w:pPr>
+      <w:r>
+        <w:rPr>
+          <w:rFonts w:cs="Times New Roman"/>
+        </w:rPr>
+        <w:t xml:space="preserve">3.3.7 Підтримуваність </w:t>
+      </w:r>
+    </w:p>
+    <w:p>
+      <w:pPr>
+        <w:pBdr>
+          <w:top w:val="none" w:sz="0" w:space="0" w:color="auto"/>
+          <w:left w:val="none" w:sz="0" w:space="0" w:color="auto"/>
+          <w:bottom w:val="none" w:sz="0" w:space="0" w:color="auto"/>
+          <w:right w:val="none" w:sz="0" w:space="0" w:color="auto"/>
+          <w:between w:val="none" w:sz="0" w:space="0" w:color="auto"/>
+          <w:bar w:val="none" w:sz="0" w:color="auto"/>
+        </w:pBdr>
+        <w:rPr>
+          <w:rFonts w:cs="Times New Roman"/>
+        </w:rPr>
+      </w:pPr>
+      <w:r>
+        <w:rPr>
+          <w:rFonts w:cs="Times New Roman"/>
+        </w:rPr>
+        <w:t>Використання TypeScript на обох рівнях (клієнт/сервер) забезпечує сувору типізацію та знижує кількість помилок на етапі розробки, спрощуючи подальшу підтримку коду.</w:t>
       </w:r>
     </w:p>
     <w:p>
@@ -5254,10 +3098,15 @@
           <w:szCs w:val="28"/>
           <w:bdr w:val="nil"/>
         </w:rPr>
-        <w:t xml:space="preserve">У системі використовується реляційна система управління базами даних </w:t>
-      </w:r>
-      <w:proofErr w:type="spellStart"/>
-      <w:r>
+        <w:t>У системі використовується реляційна система управління базами даних PostgreSQL. Проєктування бази даних базується на підході Code-First за допомогою TypeORM.</w:t>
+      </w:r>
+    </w:p>
+    <w:p>
+      <w:pPr>
+        <w:pStyle w:val="NormalWeb"/>
+        <w:spacing w:before="0" w:beforeAutospacing="0" w:after="0" w:afterAutospacing="0" w:line="360" w:lineRule="auto"/>
+        <w:ind w:firstLine="720"/>
+        <w:jc w:val="both"/>
         <w:rPr>
           <w:rFonts w:eastAsia="Arial Unicode MS"/>
           <w:color w:val="000000"/>
@@ -5266,9 +3115,7 @@
           <w:szCs w:val="28"/>
           <w:bdr w:val="nil"/>
         </w:rPr>
-        <w:t>PostgreSQL</w:t>
-      </w:r>
-      <w:proofErr w:type="spellEnd"/>
+      </w:pPr>
       <w:r>
         <w:rPr>
           <w:rFonts w:eastAsia="Arial Unicode MS"/>
@@ -5278,81 +3125,6 @@
           <w:szCs w:val="28"/>
           <w:bdr w:val="nil"/>
         </w:rPr>
-        <w:t xml:space="preserve">. Проєктування бази даних базується на підході </w:t>
-      </w:r>
-      <w:proofErr w:type="spellStart"/>
-      <w:r>
-        <w:rPr>
-          <w:rFonts w:eastAsia="Arial Unicode MS"/>
-          <w:color w:val="000000"/>
-          <w:kern w:val="2"/>
-          <w:sz w:val="28"/>
-          <w:szCs w:val="28"/>
-          <w:bdr w:val="nil"/>
-        </w:rPr>
-        <w:t>Code-First</w:t>
-      </w:r>
-      <w:proofErr w:type="spellEnd"/>
-      <w:r>
-        <w:rPr>
-          <w:rFonts w:eastAsia="Arial Unicode MS"/>
-          <w:color w:val="000000"/>
-          <w:kern w:val="2"/>
-          <w:sz w:val="28"/>
-          <w:szCs w:val="28"/>
-          <w:bdr w:val="nil"/>
-        </w:rPr>
-        <w:t xml:space="preserve"> за допомогою </w:t>
-      </w:r>
-      <w:proofErr w:type="spellStart"/>
-      <w:r>
-        <w:rPr>
-          <w:rFonts w:eastAsia="Arial Unicode MS"/>
-          <w:color w:val="000000"/>
-          <w:kern w:val="2"/>
-          <w:sz w:val="28"/>
-          <w:szCs w:val="28"/>
-          <w:bdr w:val="nil"/>
-        </w:rPr>
-        <w:t>TypeORM</w:t>
-      </w:r>
-      <w:proofErr w:type="spellEnd"/>
-      <w:r>
-        <w:rPr>
-          <w:rFonts w:eastAsia="Arial Unicode MS"/>
-          <w:color w:val="000000"/>
-          <w:kern w:val="2"/>
-          <w:sz w:val="28"/>
-          <w:szCs w:val="28"/>
-          <w:bdr w:val="nil"/>
-        </w:rPr>
-        <w:t>.</w:t>
-      </w:r>
-    </w:p>
-    <w:p>
-      <w:pPr>
-        <w:pStyle w:val="NormalWeb"/>
-        <w:spacing w:before="0" w:beforeAutospacing="0" w:after="0" w:afterAutospacing="0" w:line="360" w:lineRule="auto"/>
-        <w:ind w:firstLine="720"/>
-        <w:jc w:val="both"/>
-        <w:rPr>
-          <w:rFonts w:eastAsia="Arial Unicode MS"/>
-          <w:color w:val="000000"/>
-          <w:kern w:val="2"/>
-          <w:sz w:val="28"/>
-          <w:szCs w:val="28"/>
-          <w:bdr w:val="nil"/>
-        </w:rPr>
-      </w:pPr>
-      <w:r>
-        <w:rPr>
-          <w:rFonts w:eastAsia="Arial Unicode MS"/>
-          <w:color w:val="000000"/>
-          <w:kern w:val="2"/>
-          <w:sz w:val="28"/>
-          <w:szCs w:val="28"/>
-          <w:bdr w:val="nil"/>
-        </w:rPr>
         <w:t>Основні вимоги до бази даних:</w:t>
       </w:r>
     </w:p>
@@ -5367,49 +3139,7 @@
         <w:rPr>
           <w:bdr w:val="nil"/>
         </w:rPr>
-        <w:t xml:space="preserve">наявність ключових таблиць </w:t>
-      </w:r>
-      <w:proofErr w:type="spellStart"/>
-      <w:r>
-        <w:rPr>
-          <w:bdr w:val="nil"/>
-        </w:rPr>
-        <w:t>users</w:t>
-      </w:r>
-      <w:proofErr w:type="spellEnd"/>
-      <w:r>
-        <w:rPr>
-          <w:bdr w:val="nil"/>
-        </w:rPr>
-        <w:t xml:space="preserve">, </w:t>
-      </w:r>
-      <w:proofErr w:type="spellStart"/>
-      <w:r>
-        <w:rPr>
-          <w:bdr w:val="nil"/>
-        </w:rPr>
-        <w:t>products</w:t>
-      </w:r>
-      <w:proofErr w:type="spellEnd"/>
-      <w:r>
-        <w:rPr>
-          <w:bdr w:val="nil"/>
-        </w:rPr>
-        <w:t xml:space="preserve">, </w:t>
-      </w:r>
-      <w:proofErr w:type="spellStart"/>
-      <w:r>
-        <w:rPr>
-          <w:bdr w:val="nil"/>
-        </w:rPr>
-        <w:t>shops</w:t>
-      </w:r>
-      <w:proofErr w:type="spellEnd"/>
-      <w:r>
-        <w:rPr>
-          <w:bdr w:val="nil"/>
-        </w:rPr>
-        <w:t>;</w:t>
+        <w:t>наявність ключових таблиць users, products, shops;</w:t>
       </w:r>
     </w:p>
     <w:p>
@@ -5423,35 +3153,7 @@
         <w:rPr>
           <w:bdr w:val="nil"/>
         </w:rPr>
-        <w:t xml:space="preserve">використання таблиць </w:t>
-      </w:r>
-      <w:proofErr w:type="spellStart"/>
-      <w:r>
-        <w:rPr>
-          <w:bdr w:val="nil"/>
-        </w:rPr>
-        <w:t>shop_products</w:t>
-      </w:r>
-      <w:proofErr w:type="spellEnd"/>
-      <w:r>
-        <w:rPr>
-          <w:bdr w:val="nil"/>
-        </w:rPr>
-        <w:t xml:space="preserve"> для крос-маркет порівняння та </w:t>
-      </w:r>
-      <w:proofErr w:type="spellStart"/>
-      <w:r>
-        <w:rPr>
-          <w:bdr w:val="nil"/>
-        </w:rPr>
-        <w:t>shops_product_history</w:t>
-      </w:r>
-      <w:proofErr w:type="spellEnd"/>
-      <w:r>
-        <w:rPr>
-          <w:bdr w:val="nil"/>
-        </w:rPr>
-        <w:t xml:space="preserve"> для фіксації часових рядів змін цін;</w:t>
+        <w:t>використання таблиць shop_products для крос-маркет порівняння та shops_product_history для фіксації часових рядів змін цін;</w:t>
       </w:r>
     </w:p>
     <w:p>
@@ -5465,35 +3167,7 @@
         <w:rPr>
           <w:bdr w:val="nil"/>
         </w:rPr>
-        <w:t>таблиця історичних даних має бути оптимізована для швидких операцій читання за діапазоном дат (наприклад, за допомогою B-</w:t>
-      </w:r>
-      <w:proofErr w:type="spellStart"/>
-      <w:r>
-        <w:rPr>
-          <w:bdr w:val="nil"/>
-        </w:rPr>
-        <w:t>Tree</w:t>
-      </w:r>
-      <w:proofErr w:type="spellEnd"/>
-      <w:r>
-        <w:rPr>
-          <w:bdr w:val="nil"/>
-        </w:rPr>
-        <w:t xml:space="preserve"> індексів на стовпцях дати та </w:t>
-      </w:r>
-      <w:proofErr w:type="spellStart"/>
-      <w:r>
-        <w:rPr>
-          <w:bdr w:val="nil"/>
-        </w:rPr>
-        <w:t>product_id</w:t>
-      </w:r>
-      <w:proofErr w:type="spellEnd"/>
-      <w:r>
-        <w:rPr>
-          <w:bdr w:val="nil"/>
-        </w:rPr>
-        <w:t>).</w:t>
+        <w:t>таблиця історичних даних має бути оптимізована для швидких операцій читання за діапазоном дат (наприклад, за допомогою B-Tree індексів на стовпцях дати та product_id).</w:t>
       </w:r>
     </w:p>
     <w:p>
@@ -5505,19 +3179,7 @@
         </w:rPr>
       </w:pPr>
     </w:p>
-    <w:p>
-      <w:pPr>
-        <w:spacing w:line="240" w:lineRule="auto"/>
-        <w:ind w:firstLine="0"/>
-        <w:rPr>
-          <w:rFonts w:eastAsia="Times New Roman" w:cs="Times New Roman"/>
-          <w:b/>
-          <w:bCs/>
-          <w:caps/>
-          <w:lang w:val="ru-RU"/>
-        </w:rPr>
-      </w:pPr>
-    </w:p>
+    <w:p/>
     <w:sectPr>
       <w:headerReference w:type="even" r:id="rId12"/>
       <w:headerReference w:type="default" r:id="rId13"/>
@@ -9529,7 +7191,6 @@
     <w:name w:val="Normal (Web)"/>
     <w:basedOn w:val="Normal"/>
     <w:uiPriority w:val="99"/>
-    <w:semiHidden/>
     <w:unhideWhenUsed/>
     <w:rsid w:val="00A14C82"/>
     <w:pPr>

</xml_diff>